<commit_message>
Expand guide and organize contents
Co-authored-by: arena-agent <297053741+arena-agent@users.noreply.github.com>
</commit_message>
<xml_diff>
--- a/كتاب_الكاتب_الصغير_دليل_الميسر.docx
+++ b/كتاب_الكاتب_الصغير_دليل_الميسر.docx
@@ -382,6 +382,20 @@
     </w:p>
     <w:p>
       <w:pPr>
+        <w:pStyle w:val="Heading3"/>
+        <w:jc w:val="right"/>
+        <w:bidi w:val="1"/>
+      </w:pPr>
+      <w:r>
+        <w:rPr>
+          <w:rFonts w:ascii="Arial" w:hAnsi="Arial" w:cs="Arial" w:eastAsia="Arial"/>
+          <w:rtl w:val="1"/>
+        </w:rPr>
+        <w:t>الإطار المنهجي والتمهيد</w:t>
+      </w:r>
+    </w:p>
+    <w:p>
+      <w:pPr>
         <w:spacing w:after="60"/>
         <w:ind w:right="198" w:hanging="142"/>
         <w:jc w:val="right"/>
@@ -407,6 +421,51 @@
           <w:rFonts w:ascii="Arial" w:hAnsi="Arial" w:cs="Arial" w:eastAsia="Arial"/>
           <w:rtl w:val="1"/>
         </w:rPr>
+        <w:t>• مخرجات التعلم</w:t>
+      </w:r>
+    </w:p>
+    <w:p>
+      <w:pPr>
+        <w:spacing w:after="60"/>
+        <w:ind w:right="198" w:hanging="142"/>
+        <w:jc w:val="right"/>
+        <w:bidi w:val="1"/>
+      </w:pPr>
+      <w:r>
+        <w:rPr>
+          <w:rFonts w:ascii="Arial" w:hAnsi="Arial" w:cs="Arial" w:eastAsia="Arial"/>
+          <w:rtl w:val="1"/>
+        </w:rPr>
+        <w:t>• ما الذي يصنعه الطفل في نهاية البرنامج؟</w:t>
+      </w:r>
+    </w:p>
+    <w:p>
+      <w:pPr>
+        <w:spacing w:after="60"/>
+        <w:ind w:right="198" w:hanging="142"/>
+        <w:jc w:val="right"/>
+        <w:bidi w:val="1"/>
+      </w:pPr>
+      <w:r>
+        <w:rPr>
+          <w:rFonts w:ascii="Arial" w:hAnsi="Arial" w:cs="Arial" w:eastAsia="Arial"/>
+          <w:rtl w:val="1"/>
+        </w:rPr>
+        <w:t>• حدود هذا الدليل</w:t>
+      </w:r>
+    </w:p>
+    <w:p>
+      <w:pPr>
+        <w:spacing w:after="60"/>
+        <w:ind w:right="198" w:hanging="142"/>
+        <w:jc w:val="right"/>
+        <w:bidi w:val="1"/>
+      </w:pPr>
+      <w:r>
+        <w:rPr>
+          <w:rFonts w:ascii="Arial" w:hAnsi="Arial" w:cs="Arial" w:eastAsia="Arial"/>
+          <w:rtl w:val="1"/>
+        </w:rPr>
         <w:t>2. لمن هذا الدليل؟ وكيف يُستخدم؟</w:t>
       </w:r>
     </w:p>
@@ -422,6 +481,51 @@
           <w:rFonts w:ascii="Arial" w:hAnsi="Arial" w:cs="Arial" w:eastAsia="Arial"/>
           <w:rtl w:val="1"/>
         </w:rPr>
+        <w:t>• لمن كُتب؟</w:t>
+      </w:r>
+    </w:p>
+    <w:p>
+      <w:pPr>
+        <w:spacing w:after="60"/>
+        <w:ind w:right="198" w:hanging="142"/>
+        <w:jc w:val="right"/>
+        <w:bidi w:val="1"/>
+      </w:pPr>
+      <w:r>
+        <w:rPr>
+          <w:rFonts w:ascii="Arial" w:hAnsi="Arial" w:cs="Arial" w:eastAsia="Arial"/>
+          <w:rtl w:val="1"/>
+        </w:rPr>
+        <w:t>• كيف تقرأ الفصول؟</w:t>
+      </w:r>
+    </w:p>
+    <w:p>
+      <w:pPr>
+        <w:spacing w:after="60"/>
+        <w:ind w:right="198" w:hanging="142"/>
+        <w:jc w:val="right"/>
+        <w:bidi w:val="1"/>
+      </w:pPr>
+      <w:r>
+        <w:rPr>
+          <w:rFonts w:ascii="Arial" w:hAnsi="Arial" w:cs="Arial" w:eastAsia="Arial"/>
+          <w:rtl w:val="1"/>
+        </w:rPr>
+        <w:t>• الفئة العمرية والإيقاع</w:t>
+      </w:r>
+    </w:p>
+    <w:p>
+      <w:pPr>
+        <w:spacing w:after="60"/>
+        <w:ind w:right="198" w:hanging="142"/>
+        <w:jc w:val="right"/>
+        <w:bidi w:val="1"/>
+      </w:pPr>
+      <w:r>
+        <w:rPr>
+          <w:rFonts w:ascii="Arial" w:hAnsi="Arial" w:cs="Arial" w:eastAsia="Arial"/>
+          <w:rtl w:val="1"/>
+        </w:rPr>
         <w:t>3. خريطة المنهج وتدرجه</w:t>
       </w:r>
     </w:p>
@@ -437,6 +541,51 @@
           <w:rFonts w:ascii="Arial" w:hAnsi="Arial" w:cs="Arial" w:eastAsia="Arial"/>
           <w:rtl w:val="1"/>
         </w:rPr>
+        <w:t>• منهج الكاتب الصغير</w:t>
+      </w:r>
+    </w:p>
+    <w:p>
+      <w:pPr>
+        <w:spacing w:after="60"/>
+        <w:ind w:right="198" w:hanging="142"/>
+        <w:jc w:val="right"/>
+        <w:bidi w:val="1"/>
+      </w:pPr>
+      <w:r>
+        <w:rPr>
+          <w:rFonts w:ascii="Arial" w:hAnsi="Arial" w:cs="Arial" w:eastAsia="Arial"/>
+          <w:rtl w:val="1"/>
+        </w:rPr>
+        <w:t>• مستويات التدرج الأربعة</w:t>
+      </w:r>
+    </w:p>
+    <w:p>
+      <w:pPr>
+        <w:spacing w:after="60"/>
+        <w:ind w:right="198" w:hanging="142"/>
+        <w:jc w:val="right"/>
+        <w:bidi w:val="1"/>
+      </w:pPr>
+      <w:r>
+        <w:rPr>
+          <w:rFonts w:ascii="Arial" w:hAnsi="Arial" w:cs="Arial" w:eastAsia="Arial"/>
+          <w:rtl w:val="1"/>
+        </w:rPr>
+        <w:t>• كيف تتصل الوحدات؟</w:t>
+      </w:r>
+    </w:p>
+    <w:p>
+      <w:pPr>
+        <w:spacing w:after="60"/>
+        <w:ind w:right="198" w:hanging="142"/>
+        <w:jc w:val="right"/>
+        <w:bidi w:val="1"/>
+      </w:pPr>
+      <w:r>
+        <w:rPr>
+          <w:rFonts w:ascii="Arial" w:hAnsi="Arial" w:cs="Arial" w:eastAsia="Arial"/>
+          <w:rtl w:val="1"/>
+        </w:rPr>
         <w:t>4. طريقة التعليم داخل اللقاء</w:t>
       </w:r>
     </w:p>
@@ -452,6 +601,81 @@
           <w:rFonts w:ascii="Arial" w:hAnsi="Arial" w:cs="Arial" w:eastAsia="Arial"/>
           <w:rtl w:val="1"/>
         </w:rPr>
+        <w:t>• دورة «أعرض، نجرّب، تكتب أنت»</w:t>
+      </w:r>
+    </w:p>
+    <w:p>
+      <w:pPr>
+        <w:spacing w:after="60"/>
+        <w:ind w:right="198" w:hanging="142"/>
+        <w:jc w:val="right"/>
+        <w:bidi w:val="1"/>
+      </w:pPr>
+      <w:r>
+        <w:rPr>
+          <w:rFonts w:ascii="Arial" w:hAnsi="Arial" w:cs="Arial" w:eastAsia="Arial"/>
+          <w:rtl w:val="1"/>
+        </w:rPr>
+        <w:t>• قالب لقاء من 75–90 دقيقة</w:t>
+      </w:r>
+    </w:p>
+    <w:p>
+      <w:pPr>
+        <w:spacing w:after="60"/>
+        <w:ind w:right="198" w:hanging="142"/>
+        <w:jc w:val="right"/>
+        <w:bidi w:val="1"/>
+      </w:pPr>
+      <w:r>
+        <w:rPr>
+          <w:rFonts w:ascii="Arial" w:hAnsi="Arial" w:cs="Arial" w:eastAsia="Arial"/>
+          <w:rtl w:val="1"/>
+        </w:rPr>
+        <w:t>• الحكي الشفهي جسر إلى النص</w:t>
+      </w:r>
+    </w:p>
+    <w:p>
+      <w:pPr>
+        <w:spacing w:after="60"/>
+        <w:ind w:right="198" w:hanging="142"/>
+        <w:jc w:val="right"/>
+        <w:bidi w:val="1"/>
+      </w:pPr>
+      <w:r>
+        <w:rPr>
+          <w:rFonts w:ascii="Arial" w:hAnsi="Arial" w:cs="Arial" w:eastAsia="Arial"/>
+          <w:rtl w:val="1"/>
+        </w:rPr>
+        <w:t>• رصيد لغوي يساعد الكاتب</w:t>
+      </w:r>
+    </w:p>
+    <w:p>
+      <w:pPr>
+        <w:spacing w:after="60"/>
+        <w:ind w:right="198" w:hanging="142"/>
+        <w:jc w:val="right"/>
+        <w:bidi w:val="1"/>
+      </w:pPr>
+      <w:r>
+        <w:rPr>
+          <w:rFonts w:ascii="Arial" w:hAnsi="Arial" w:cs="Arial" w:eastAsia="Arial"/>
+          <w:rtl w:val="1"/>
+        </w:rPr>
+        <w:t>• من الكلمة إلى الفقرة</w:t>
+      </w:r>
+    </w:p>
+    <w:p>
+      <w:pPr>
+        <w:spacing w:after="60"/>
+        <w:ind w:right="198" w:hanging="142"/>
+        <w:jc w:val="right"/>
+        <w:bidi w:val="1"/>
+      </w:pPr>
+      <w:r>
+        <w:rPr>
+          <w:rFonts w:ascii="Arial" w:hAnsi="Arial" w:cs="Arial" w:eastAsia="Arial"/>
+          <w:rtl w:val="1"/>
+        </w:rPr>
         <w:t>5. التقويم وتوثيق نمو الكاتب</w:t>
       </w:r>
     </w:p>
@@ -467,6 +691,80 @@
           <w:rFonts w:ascii="Arial" w:hAnsi="Arial" w:cs="Arial" w:eastAsia="Arial"/>
           <w:rtl w:val="1"/>
         </w:rPr>
+        <w:t>• ثلاثة أوقات للتقويم</w:t>
+      </w:r>
+    </w:p>
+    <w:p>
+      <w:pPr>
+        <w:spacing w:after="60"/>
+        <w:ind w:right="198" w:hanging="142"/>
+        <w:jc w:val="right"/>
+        <w:bidi w:val="1"/>
+      </w:pPr>
+      <w:r>
+        <w:rPr>
+          <w:rFonts w:ascii="Arial" w:hAnsi="Arial" w:cs="Arial" w:eastAsia="Arial"/>
+          <w:rtl w:val="1"/>
+        </w:rPr>
+        <w:t>• مقياس وصفي من أربع درجات</w:t>
+      </w:r>
+    </w:p>
+    <w:p>
+      <w:pPr>
+        <w:spacing w:after="60"/>
+        <w:ind w:right="198" w:hanging="142"/>
+        <w:jc w:val="right"/>
+        <w:bidi w:val="1"/>
+      </w:pPr>
+      <w:r>
+        <w:rPr>
+          <w:rFonts w:ascii="Arial" w:hAnsi="Arial" w:cs="Arial" w:eastAsia="Arial"/>
+          <w:rtl w:val="1"/>
+        </w:rPr>
+        <w:t>• مجالات المتابعة</w:t>
+      </w:r>
+    </w:p>
+    <w:p>
+      <w:pPr>
+        <w:spacing w:after="60"/>
+        <w:ind w:right="198" w:hanging="142"/>
+        <w:jc w:val="right"/>
+        <w:bidi w:val="1"/>
+      </w:pPr>
+      <w:r>
+        <w:rPr>
+          <w:rFonts w:ascii="Arial" w:hAnsi="Arial" w:cs="Arial" w:eastAsia="Arial"/>
+          <w:rtl w:val="1"/>
+        </w:rPr>
+        <w:t>• ملف الكاتب</w:t>
+      </w:r>
+    </w:p>
+    <w:p>
+      <w:pPr>
+        <w:pStyle w:val="Heading3"/>
+        <w:jc w:val="right"/>
+        <w:bidi w:val="1"/>
+      </w:pPr>
+      <w:r>
+        <w:rPr>
+          <w:rFonts w:ascii="Arial" w:hAnsi="Arial" w:cs="Arial" w:eastAsia="Arial"/>
+          <w:rtl w:val="1"/>
+        </w:rPr>
+        <w:t>المستوى الأول: ألاحظ وأتخيل</w:t>
+      </w:r>
+    </w:p>
+    <w:p>
+      <w:pPr>
+        <w:spacing w:after="60"/>
+        <w:ind w:right="198" w:hanging="142"/>
+        <w:jc w:val="right"/>
+        <w:bidi w:val="1"/>
+      </w:pPr>
+      <w:r>
+        <w:rPr>
+          <w:rFonts w:ascii="Arial" w:hAnsi="Arial" w:cs="Arial" w:eastAsia="Arial"/>
+          <w:rtl w:val="1"/>
+        </w:rPr>
         <w:t>6. الوحدة الأولى: اكتشاف الحكاية وعناصرها</w:t>
       </w:r>
     </w:p>
@@ -482,6 +780,111 @@
           <w:rFonts w:ascii="Arial" w:hAnsi="Arial" w:cs="Arial" w:eastAsia="Arial"/>
           <w:rtl w:val="1"/>
         </w:rPr>
+        <w:t>• لغة تقولها للطفل</w:t>
+      </w:r>
+    </w:p>
+    <w:p>
+      <w:pPr>
+        <w:spacing w:after="60"/>
+        <w:ind w:right="198" w:hanging="142"/>
+        <w:jc w:val="right"/>
+        <w:bidi w:val="1"/>
+      </w:pPr>
+      <w:r>
+        <w:rPr>
+          <w:rFonts w:ascii="Arial" w:hAnsi="Arial" w:cs="Arial" w:eastAsia="Arial"/>
+          <w:rtl w:val="1"/>
+        </w:rPr>
+        <w:t>• الفكرة الأساسية للميسّر</w:t>
+      </w:r>
+    </w:p>
+    <w:p>
+      <w:pPr>
+        <w:spacing w:after="60"/>
+        <w:ind w:right="198" w:hanging="142"/>
+        <w:jc w:val="right"/>
+        <w:bidi w:val="1"/>
+      </w:pPr>
+      <w:r>
+        <w:rPr>
+          <w:rFonts w:ascii="Arial" w:hAnsi="Arial" w:cs="Arial" w:eastAsia="Arial"/>
+          <w:rtl w:val="1"/>
+        </w:rPr>
+        <w:t>• اللقاء الأول: ماذا يجعل الحكاية تتحرك؟</w:t>
+      </w:r>
+    </w:p>
+    <w:p>
+      <w:pPr>
+        <w:spacing w:after="60"/>
+        <w:ind w:right="198" w:hanging="142"/>
+        <w:jc w:val="right"/>
+        <w:bidi w:val="1"/>
+      </w:pPr>
+      <w:r>
+        <w:rPr>
+          <w:rFonts w:ascii="Arial" w:hAnsi="Arial" w:cs="Arial" w:eastAsia="Arial"/>
+          <w:rtl w:val="1"/>
+        </w:rPr>
+        <w:t>• اللقاء الثاني: من صور متفرقة إلى حكاية</w:t>
+      </w:r>
+    </w:p>
+    <w:p>
+      <w:pPr>
+        <w:spacing w:after="60"/>
+        <w:ind w:right="198" w:hanging="142"/>
+        <w:jc w:val="right"/>
+        <w:bidi w:val="1"/>
+      </w:pPr>
+      <w:r>
+        <w:rPr>
+          <w:rFonts w:ascii="Arial" w:hAnsi="Arial" w:cs="Arial" w:eastAsia="Arial"/>
+          <w:rtl w:val="1"/>
+        </w:rPr>
+        <w:t>• أسئلة متابعة تكشف فهم الحكاية</w:t>
+      </w:r>
+    </w:p>
+    <w:p>
+      <w:pPr>
+        <w:spacing w:after="60"/>
+        <w:ind w:right="198" w:hanging="142"/>
+        <w:jc w:val="right"/>
+        <w:bidi w:val="1"/>
+      </w:pPr>
+      <w:r>
+        <w:rPr>
+          <w:rFonts w:ascii="Arial" w:hAnsi="Arial" w:cs="Arial" w:eastAsia="Arial"/>
+          <w:rtl w:val="1"/>
+        </w:rPr>
+        <w:t>• نشاطات متدرجة للوحدة</w:t>
+      </w:r>
+    </w:p>
+    <w:p>
+      <w:pPr>
+        <w:spacing w:after="60"/>
+        <w:ind w:right="198" w:hanging="142"/>
+        <w:jc w:val="right"/>
+        <w:bidi w:val="1"/>
+      </w:pPr>
+      <w:r>
+        <w:rPr>
+          <w:rFonts w:ascii="Arial" w:hAnsi="Arial" w:cs="Arial" w:eastAsia="Arial"/>
+          <w:rtl w:val="1"/>
+        </w:rPr>
+        <w:t>• مثال نمذجة بصوت مسموع</w:t>
+      </w:r>
+    </w:p>
+    <w:p>
+      <w:pPr>
+        <w:spacing w:after="60"/>
+        <w:ind w:right="198" w:hanging="142"/>
+        <w:jc w:val="right"/>
+        <w:bidi w:val="1"/>
+      </w:pPr>
+      <w:r>
+        <w:rPr>
+          <w:rFonts w:ascii="Arial" w:hAnsi="Arial" w:cs="Arial" w:eastAsia="Arial"/>
+          <w:rtl w:val="1"/>
+        </w:rPr>
         <w:t>7. الوحدة الثانية: توليد الفكرة واختيار نوع القصة</w:t>
       </w:r>
     </w:p>
@@ -497,6 +900,125 @@
           <w:rFonts w:ascii="Arial" w:hAnsi="Arial" w:cs="Arial" w:eastAsia="Arial"/>
           <w:rtl w:val="1"/>
         </w:rPr>
+        <w:t>• مصادر الفكرة</w:t>
+      </w:r>
+    </w:p>
+    <w:p>
+      <w:pPr>
+        <w:spacing w:after="60"/>
+        <w:ind w:right="198" w:hanging="142"/>
+        <w:jc w:val="right"/>
+        <w:bidi w:val="1"/>
+      </w:pPr>
+      <w:r>
+        <w:rPr>
+          <w:rFonts w:ascii="Arial" w:hAnsi="Arial" w:cs="Arial" w:eastAsia="Arial"/>
+          <w:rtl w:val="1"/>
+        </w:rPr>
+        <w:t>• من الموضوع إلى البذرة</w:t>
+      </w:r>
+    </w:p>
+    <w:p>
+      <w:pPr>
+        <w:spacing w:after="60"/>
+        <w:ind w:right="198" w:hanging="142"/>
+        <w:jc w:val="right"/>
+        <w:bidi w:val="1"/>
+      </w:pPr>
+      <w:r>
+        <w:rPr>
+          <w:rFonts w:ascii="Arial" w:hAnsi="Arial" w:cs="Arial" w:eastAsia="Arial"/>
+          <w:rtl w:val="1"/>
+        </w:rPr>
+        <w:t>• اللقاء الأول: فتح مخزن الأفكار</w:t>
+      </w:r>
+    </w:p>
+    <w:p>
+      <w:pPr>
+        <w:spacing w:after="60"/>
+        <w:ind w:right="198" w:hanging="142"/>
+        <w:jc w:val="right"/>
+        <w:bidi w:val="1"/>
+      </w:pPr>
+      <w:r>
+        <w:rPr>
+          <w:rFonts w:ascii="Arial" w:hAnsi="Arial" w:cs="Arial" w:eastAsia="Arial"/>
+          <w:rtl w:val="1"/>
+        </w:rPr>
+        <w:t>• اللقاء الثاني: اختيار نوع القصة ورفع السؤال</w:t>
+      </w:r>
+    </w:p>
+    <w:p>
+      <w:pPr>
+        <w:spacing w:after="60"/>
+        <w:ind w:right="198" w:hanging="142"/>
+        <w:jc w:val="right"/>
+        <w:bidi w:val="1"/>
+      </w:pPr>
+      <w:r>
+        <w:rPr>
+          <w:rFonts w:ascii="Arial" w:hAnsi="Arial" w:cs="Arial" w:eastAsia="Arial"/>
+          <w:rtl w:val="1"/>
+        </w:rPr>
+        <w:t>• أسئلة اختيار البذرة</w:t>
+      </w:r>
+    </w:p>
+    <w:p>
+      <w:pPr>
+        <w:spacing w:after="60"/>
+        <w:ind w:right="198" w:hanging="142"/>
+        <w:jc w:val="right"/>
+        <w:bidi w:val="1"/>
+      </w:pPr>
+      <w:r>
+        <w:rPr>
+          <w:rFonts w:ascii="Arial" w:hAnsi="Arial" w:cs="Arial" w:eastAsia="Arial"/>
+          <w:rtl w:val="1"/>
+        </w:rPr>
+        <w:t>• مولدات فكرة بحسب نقطة الانطلاق</w:t>
+      </w:r>
+    </w:p>
+    <w:p>
+      <w:pPr>
+        <w:spacing w:after="60"/>
+        <w:ind w:right="198" w:hanging="142"/>
+        <w:jc w:val="right"/>
+        <w:bidi w:val="1"/>
+      </w:pPr>
+      <w:r>
+        <w:rPr>
+          <w:rFonts w:ascii="Arial" w:hAnsi="Arial" w:cs="Arial" w:eastAsia="Arial"/>
+          <w:rtl w:val="1"/>
+        </w:rPr>
+        <w:t>• درس مصغر: من غرض إلى بذرة</w:t>
+      </w:r>
+    </w:p>
+    <w:p>
+      <w:pPr>
+        <w:pStyle w:val="Heading3"/>
+        <w:jc w:val="right"/>
+        <w:bidi w:val="1"/>
+      </w:pPr>
+      <w:r>
+        <w:rPr>
+          <w:rFonts w:ascii="Arial" w:hAnsi="Arial" w:cs="Arial" w:eastAsia="Arial"/>
+          <w:rtl w:val="1"/>
+        </w:rPr>
+        <w:t>المستوى الثاني: أبني مواد قصتي</w:t>
+      </w:r>
+    </w:p>
+    <w:p>
+      <w:pPr>
+        <w:spacing w:after="60"/>
+        <w:ind w:right="198" w:hanging="142"/>
+        <w:jc w:val="right"/>
+        <w:bidi w:val="1"/>
+      </w:pPr>
+      <w:r>
+        <w:rPr>
+          <w:rFonts w:ascii="Arial" w:hAnsi="Arial" w:cs="Arial" w:eastAsia="Arial"/>
+          <w:rtl w:val="1"/>
+        </w:rPr>
         <w:t>8. الوحدة الثالثة: الشخصية والهدف والصراع</w:t>
       </w:r>
     </w:p>
@@ -512,6 +1034,111 @@
           <w:rFonts w:ascii="Arial" w:hAnsi="Arial" w:cs="Arial" w:eastAsia="Arial"/>
           <w:rtl w:val="1"/>
         </w:rPr>
+        <w:t>• الشخصية بوصفها رغبةً واختيارًا</w:t>
+      </w:r>
+    </w:p>
+    <w:p>
+      <w:pPr>
+        <w:spacing w:after="60"/>
+        <w:ind w:right="198" w:hanging="142"/>
+        <w:jc w:val="right"/>
+        <w:bidi w:val="1"/>
+      </w:pPr>
+      <w:r>
+        <w:rPr>
+          <w:rFonts w:ascii="Arial" w:hAnsi="Arial" w:cs="Arial" w:eastAsia="Arial"/>
+          <w:rtl w:val="1"/>
+        </w:rPr>
+        <w:t>• بطاقة بناء الشخصية</w:t>
+      </w:r>
+    </w:p>
+    <w:p>
+      <w:pPr>
+        <w:spacing w:after="60"/>
+        <w:ind w:right="198" w:hanging="142"/>
+        <w:jc w:val="right"/>
+        <w:bidi w:val="1"/>
+      </w:pPr>
+      <w:r>
+        <w:rPr>
+          <w:rFonts w:ascii="Arial" w:hAnsi="Arial" w:cs="Arial" w:eastAsia="Arial"/>
+          <w:rtl w:val="1"/>
+        </w:rPr>
+        <w:t>• الفعل أصدق من قائمة الصفات</w:t>
+      </w:r>
+    </w:p>
+    <w:p>
+      <w:pPr>
+        <w:spacing w:after="60"/>
+        <w:ind w:right="198" w:hanging="142"/>
+        <w:jc w:val="right"/>
+        <w:bidi w:val="1"/>
+      </w:pPr>
+      <w:r>
+        <w:rPr>
+          <w:rFonts w:ascii="Arial" w:hAnsi="Arial" w:cs="Arial" w:eastAsia="Arial"/>
+          <w:rtl w:val="1"/>
+        </w:rPr>
+        <w:t>• اللقاء الأول: مقابلة البطل</w:t>
+      </w:r>
+    </w:p>
+    <w:p>
+      <w:pPr>
+        <w:spacing w:after="60"/>
+        <w:ind w:right="198" w:hanging="142"/>
+        <w:jc w:val="right"/>
+        <w:bidi w:val="1"/>
+      </w:pPr>
+      <w:r>
+        <w:rPr>
+          <w:rFonts w:ascii="Arial" w:hAnsi="Arial" w:cs="Arial" w:eastAsia="Arial"/>
+          <w:rtl w:val="1"/>
+        </w:rPr>
+        <w:t>• اللقاء الثاني: قرار يكشف الشخصية</w:t>
+      </w:r>
+    </w:p>
+    <w:p>
+      <w:pPr>
+        <w:spacing w:after="60"/>
+        <w:ind w:right="198" w:hanging="142"/>
+        <w:jc w:val="right"/>
+        <w:bidi w:val="1"/>
+      </w:pPr>
+      <w:r>
+        <w:rPr>
+          <w:rFonts w:ascii="Arial" w:hAnsi="Arial" w:cs="Arial" w:eastAsia="Arial"/>
+          <w:rtl w:val="1"/>
+        </w:rPr>
+        <w:t>• الصراع الخارجي والتحدي الداخلي</w:t>
+      </w:r>
+    </w:p>
+    <w:p>
+      <w:pPr>
+        <w:spacing w:after="60"/>
+        <w:ind w:right="198" w:hanging="142"/>
+        <w:jc w:val="right"/>
+        <w:bidi w:val="1"/>
+      </w:pPr>
+      <w:r>
+        <w:rPr>
+          <w:rFonts w:ascii="Arial" w:hAnsi="Arial" w:cs="Arial" w:eastAsia="Arial"/>
+          <w:rtl w:val="1"/>
+        </w:rPr>
+        <w:t>• حوار قصير مع الشخصية</w:t>
+      </w:r>
+    </w:p>
+    <w:p>
+      <w:pPr>
+        <w:spacing w:after="60"/>
+        <w:ind w:right="198" w:hanging="142"/>
+        <w:jc w:val="right"/>
+        <w:bidi w:val="1"/>
+      </w:pPr>
+      <w:r>
+        <w:rPr>
+          <w:rFonts w:ascii="Arial" w:hAnsi="Arial" w:cs="Arial" w:eastAsia="Arial"/>
+          <w:rtl w:val="1"/>
+        </w:rPr>
         <w:t>9. الوحدة الرابعة: المكان والوصف الهادف</w:t>
       </w:r>
     </w:p>
@@ -527,6 +1154,110 @@
           <w:rFonts w:ascii="Arial" w:hAnsi="Arial" w:cs="Arial" w:eastAsia="Arial"/>
           <w:rtl w:val="1"/>
         </w:rPr>
+        <w:t>• قاعدة الوصف</w:t>
+      </w:r>
+    </w:p>
+    <w:p>
+      <w:pPr>
+        <w:spacing w:after="60"/>
+        <w:ind w:right="198" w:hanging="142"/>
+        <w:jc w:val="right"/>
+        <w:bidi w:val="1"/>
+      </w:pPr>
+      <w:r>
+        <w:rPr>
+          <w:rFonts w:ascii="Arial" w:hAnsi="Arial" w:cs="Arial" w:eastAsia="Arial"/>
+          <w:rtl w:val="1"/>
+        </w:rPr>
+        <w:t>• اللقاء الأول: المكان الذي يغير الحدث</w:t>
+      </w:r>
+    </w:p>
+    <w:p>
+      <w:pPr>
+        <w:spacing w:after="60"/>
+        <w:ind w:right="198" w:hanging="142"/>
+        <w:jc w:val="right"/>
+        <w:bidi w:val="1"/>
+      </w:pPr>
+      <w:r>
+        <w:rPr>
+          <w:rFonts w:ascii="Arial" w:hAnsi="Arial" w:cs="Arial" w:eastAsia="Arial"/>
+          <w:rtl w:val="1"/>
+        </w:rPr>
+        <w:t>• اللقاء الثاني: تفصيل واحد يصنع مشهدًا</w:t>
+      </w:r>
+    </w:p>
+    <w:p>
+      <w:pPr>
+        <w:spacing w:after="60"/>
+        <w:ind w:right="198" w:hanging="142"/>
+        <w:jc w:val="right"/>
+        <w:bidi w:val="1"/>
+      </w:pPr>
+      <w:r>
+        <w:rPr>
+          <w:rFonts w:ascii="Arial" w:hAnsi="Arial" w:cs="Arial" w:eastAsia="Arial"/>
+          <w:rtl w:val="1"/>
+        </w:rPr>
+        <w:t>• سلم الوصف: من العام إلى التفصيل</w:t>
+      </w:r>
+    </w:p>
+    <w:p>
+      <w:pPr>
+        <w:spacing w:after="60"/>
+        <w:ind w:right="198" w:hanging="142"/>
+        <w:jc w:val="right"/>
+        <w:bidi w:val="1"/>
+      </w:pPr>
+      <w:r>
+        <w:rPr>
+          <w:rFonts w:ascii="Arial" w:hAnsi="Arial" w:cs="Arial" w:eastAsia="Arial"/>
+          <w:rtl w:val="1"/>
+        </w:rPr>
+        <w:t>• من الملاحظة إلى الجملة</w:t>
+      </w:r>
+    </w:p>
+    <w:p>
+      <w:pPr>
+        <w:spacing w:after="60"/>
+        <w:ind w:right="198" w:hanging="142"/>
+        <w:jc w:val="right"/>
+        <w:bidi w:val="1"/>
+      </w:pPr>
+      <w:r>
+        <w:rPr>
+          <w:rFonts w:ascii="Arial" w:hAnsi="Arial" w:cs="Arial" w:eastAsia="Arial"/>
+          <w:rtl w:val="1"/>
+        </w:rPr>
+        <w:t>• مراجعة الوصف بثلاثة أسئلة</w:t>
+      </w:r>
+    </w:p>
+    <w:p>
+      <w:pPr>
+        <w:pStyle w:val="Heading3"/>
+        <w:jc w:val="right"/>
+        <w:bidi w:val="1"/>
+      </w:pPr>
+      <w:r>
+        <w:rPr>
+          <w:rFonts w:ascii="Arial" w:hAnsi="Arial" w:cs="Arial" w:eastAsia="Arial"/>
+          <w:rtl w:val="1"/>
+        </w:rPr>
+        <w:t>المستوى الثالث: أرتب الحكاية وأصوغها</w:t>
+      </w:r>
+    </w:p>
+    <w:p>
+      <w:pPr>
+        <w:spacing w:after="60"/>
+        <w:ind w:right="198" w:hanging="142"/>
+        <w:jc w:val="right"/>
+        <w:bidi w:val="1"/>
+      </w:pPr>
+      <w:r>
+        <w:rPr>
+          <w:rFonts w:ascii="Arial" w:hAnsi="Arial" w:cs="Arial" w:eastAsia="Arial"/>
+          <w:rtl w:val="1"/>
+        </w:rPr>
         <w:t>10. الوحدة الخامسة: الحبكة والسبب والنتيجة</w:t>
       </w:r>
     </w:p>
@@ -542,6 +1273,111 @@
           <w:rFonts w:ascii="Arial" w:hAnsi="Arial" w:cs="Arial" w:eastAsia="Arial"/>
           <w:rtl w:val="1"/>
         </w:rPr>
+        <w:t>• خريطة من سبع خطوات</w:t>
+      </w:r>
+    </w:p>
+    <w:p>
+      <w:pPr>
+        <w:spacing w:after="60"/>
+        <w:ind w:right="198" w:hanging="142"/>
+        <w:jc w:val="right"/>
+        <w:bidi w:val="1"/>
+      </w:pPr>
+      <w:r>
+        <w:rPr>
+          <w:rFonts w:ascii="Arial" w:hAnsi="Arial" w:cs="Arial" w:eastAsia="Arial"/>
+          <w:rtl w:val="1"/>
+        </w:rPr>
+        <w:t>• السببية أهم من كثرة الأحداث</w:t>
+      </w:r>
+    </w:p>
+    <w:p>
+      <w:pPr>
+        <w:spacing w:after="60"/>
+        <w:ind w:right="198" w:hanging="142"/>
+        <w:jc w:val="right"/>
+        <w:bidi w:val="1"/>
+      </w:pPr>
+      <w:r>
+        <w:rPr>
+          <w:rFonts w:ascii="Arial" w:hAnsi="Arial" w:cs="Arial" w:eastAsia="Arial"/>
+          <w:rtl w:val="1"/>
+        </w:rPr>
+        <w:t>• اللقاء الأول: سلسلة «حدث، لذلك»</w:t>
+      </w:r>
+    </w:p>
+    <w:p>
+      <w:pPr>
+        <w:spacing w:after="60"/>
+        <w:ind w:right="198" w:hanging="142"/>
+        <w:jc w:val="right"/>
+        <w:bidi w:val="1"/>
+      </w:pPr>
+      <w:r>
+        <w:rPr>
+          <w:rFonts w:ascii="Arial" w:hAnsi="Arial" w:cs="Arial" w:eastAsia="Arial"/>
+          <w:rtl w:val="1"/>
+        </w:rPr>
+        <w:t>• اللقاء الثاني: المحاولة والعقبة والنتيجة</w:t>
+      </w:r>
+    </w:p>
+    <w:p>
+      <w:pPr>
+        <w:spacing w:after="60"/>
+        <w:ind w:right="198" w:hanging="142"/>
+        <w:jc w:val="right"/>
+        <w:bidi w:val="1"/>
+      </w:pPr>
+      <w:r>
+        <w:rPr>
+          <w:rFonts w:ascii="Arial" w:hAnsi="Arial" w:cs="Arial" w:eastAsia="Arial"/>
+          <w:rtl w:val="1"/>
+        </w:rPr>
+        <w:t>• تصميم عقبة لها وظيفة</w:t>
+      </w:r>
+    </w:p>
+    <w:p>
+      <w:pPr>
+        <w:spacing w:after="60"/>
+        <w:ind w:right="198" w:hanging="142"/>
+        <w:jc w:val="right"/>
+        <w:bidi w:val="1"/>
+      </w:pPr>
+      <w:r>
+        <w:rPr>
+          <w:rFonts w:ascii="Arial" w:hAnsi="Arial" w:cs="Arial" w:eastAsia="Arial"/>
+          <w:rtl w:val="1"/>
+        </w:rPr>
+        <w:t>• اختبار الترابط: «لأن، لكن، لذلك»</w:t>
+      </w:r>
+    </w:p>
+    <w:p>
+      <w:pPr>
+        <w:spacing w:after="60"/>
+        <w:ind w:right="198" w:hanging="142"/>
+        <w:jc w:val="right"/>
+        <w:bidi w:val="1"/>
+      </w:pPr>
+      <w:r>
+        <w:rPr>
+          <w:rFonts w:ascii="Arial" w:hAnsi="Arial" w:cs="Arial" w:eastAsia="Arial"/>
+          <w:rtl w:val="1"/>
+        </w:rPr>
+        <w:t>• فحص خريطة الحبكة قبل كتابة المسودة</w:t>
+      </w:r>
+    </w:p>
+    <w:p>
+      <w:pPr>
+        <w:spacing w:after="60"/>
+        <w:ind w:right="198" w:hanging="142"/>
+        <w:jc w:val="right"/>
+        <w:bidi w:val="1"/>
+      </w:pPr>
+      <w:r>
+        <w:rPr>
+          <w:rFonts w:ascii="Arial" w:hAnsi="Arial" w:cs="Arial" w:eastAsia="Arial"/>
+          <w:rtl w:val="1"/>
+        </w:rPr>
         <w:t>11. الوحدة السادسة: البداية والراوي والمشهد</w:t>
       </w:r>
     </w:p>
@@ -557,6 +1393,126 @@
           <w:rFonts w:ascii="Arial" w:hAnsi="Arial" w:cs="Arial" w:eastAsia="Arial"/>
           <w:rtl w:val="1"/>
         </w:rPr>
+        <w:t>• أربعة مداخل للبداية</w:t>
+      </w:r>
+    </w:p>
+    <w:p>
+      <w:pPr>
+        <w:spacing w:after="60"/>
+        <w:ind w:right="198" w:hanging="142"/>
+        <w:jc w:val="right"/>
+        <w:bidi w:val="1"/>
+      </w:pPr>
+      <w:r>
+        <w:rPr>
+          <w:rFonts w:ascii="Arial" w:hAnsi="Arial" w:cs="Arial" w:eastAsia="Arial"/>
+          <w:rtl w:val="1"/>
+        </w:rPr>
+        <w:t>• الراوي ووجهة النظر</w:t>
+      </w:r>
+    </w:p>
+    <w:p>
+      <w:pPr>
+        <w:spacing w:after="60"/>
+        <w:ind w:right="198" w:hanging="142"/>
+        <w:jc w:val="right"/>
+        <w:bidi w:val="1"/>
+      </w:pPr>
+      <w:r>
+        <w:rPr>
+          <w:rFonts w:ascii="Arial" w:hAnsi="Arial" w:cs="Arial" w:eastAsia="Arial"/>
+          <w:rtl w:val="1"/>
+        </w:rPr>
+        <w:t>• المشهد والتلخيص</w:t>
+      </w:r>
+    </w:p>
+    <w:p>
+      <w:pPr>
+        <w:spacing w:after="60"/>
+        <w:ind w:right="198" w:hanging="142"/>
+        <w:jc w:val="right"/>
+        <w:bidi w:val="1"/>
+      </w:pPr>
+      <w:r>
+        <w:rPr>
+          <w:rFonts w:ascii="Arial" w:hAnsi="Arial" w:cs="Arial" w:eastAsia="Arial"/>
+          <w:rtl w:val="1"/>
+        </w:rPr>
+        <w:t>• اللقاء الأول: البداية من ثلاث نوافذ</w:t>
+      </w:r>
+    </w:p>
+    <w:p>
+      <w:pPr>
+        <w:spacing w:after="60"/>
+        <w:ind w:right="198" w:hanging="142"/>
+        <w:jc w:val="right"/>
+        <w:bidi w:val="1"/>
+      </w:pPr>
+      <w:r>
+        <w:rPr>
+          <w:rFonts w:ascii="Arial" w:hAnsi="Arial" w:cs="Arial" w:eastAsia="Arial"/>
+          <w:rtl w:val="1"/>
+        </w:rPr>
+        <w:t>• اللقاء الثاني: كاميرا قريبة وبعيدة</w:t>
+      </w:r>
+    </w:p>
+    <w:p>
+      <w:pPr>
+        <w:spacing w:after="60"/>
+        <w:ind w:right="198" w:hanging="142"/>
+        <w:jc w:val="right"/>
+        <w:bidi w:val="1"/>
+      </w:pPr>
+      <w:r>
+        <w:rPr>
+          <w:rFonts w:ascii="Arial" w:hAnsi="Arial" w:cs="Arial" w:eastAsia="Arial"/>
+          <w:rtl w:val="1"/>
+        </w:rPr>
+        <w:t>• بناء مشهد وجملة واضحة</w:t>
+      </w:r>
+    </w:p>
+    <w:p>
+      <w:pPr>
+        <w:spacing w:after="60"/>
+        <w:ind w:right="198" w:hanging="142"/>
+        <w:jc w:val="right"/>
+        <w:bidi w:val="1"/>
+      </w:pPr>
+      <w:r>
+        <w:rPr>
+          <w:rFonts w:ascii="Arial" w:hAnsi="Arial" w:cs="Arial" w:eastAsia="Arial"/>
+          <w:rtl w:val="1"/>
+        </w:rPr>
+        <w:t>• من الكلمة إلى الجملة ثم الفقرة</w:t>
+      </w:r>
+    </w:p>
+    <w:p>
+      <w:pPr>
+        <w:spacing w:after="60"/>
+        <w:ind w:right="198" w:hanging="142"/>
+        <w:jc w:val="right"/>
+        <w:bidi w:val="1"/>
+      </w:pPr>
+      <w:r>
+        <w:rPr>
+          <w:rFonts w:ascii="Arial" w:hAnsi="Arial" w:cs="Arial" w:eastAsia="Arial"/>
+          <w:rtl w:val="1"/>
+        </w:rPr>
+        <w:t>• روابط تخدم المعنى</w:t>
+      </w:r>
+    </w:p>
+    <w:p>
+      <w:pPr>
+        <w:spacing w:after="60"/>
+        <w:ind w:right="198" w:hanging="142"/>
+        <w:jc w:val="right"/>
+        <w:bidi w:val="1"/>
+      </w:pPr>
+      <w:r>
+        <w:rPr>
+          <w:rFonts w:ascii="Arial" w:hAnsi="Arial" w:cs="Arial" w:eastAsia="Arial"/>
+          <w:rtl w:val="1"/>
+        </w:rPr>
         <w:t>12. الوحدة السابعة: السرد والحوار والنهاية</w:t>
       </w:r>
     </w:p>
@@ -572,6 +1528,125 @@
           <w:rFonts w:ascii="Arial" w:hAnsi="Arial" w:cs="Arial" w:eastAsia="Arial"/>
           <w:rtl w:val="1"/>
         </w:rPr>
+        <w:t>• وظيفة كل أداة</w:t>
+      </w:r>
+    </w:p>
+    <w:p>
+      <w:pPr>
+        <w:spacing w:after="60"/>
+        <w:ind w:right="198" w:hanging="142"/>
+        <w:jc w:val="right"/>
+        <w:bidi w:val="1"/>
+      </w:pPr>
+      <w:r>
+        <w:rPr>
+          <w:rFonts w:ascii="Arial" w:hAnsi="Arial" w:cs="Arial" w:eastAsia="Arial"/>
+          <w:rtl w:val="1"/>
+        </w:rPr>
+        <w:t>• الحوار الذي يخدم المشهد</w:t>
+      </w:r>
+    </w:p>
+    <w:p>
+      <w:pPr>
+        <w:spacing w:after="60"/>
+        <w:ind w:right="198" w:hanging="142"/>
+        <w:jc w:val="right"/>
+        <w:bidi w:val="1"/>
+      </w:pPr>
+      <w:r>
+        <w:rPr>
+          <w:rFonts w:ascii="Arial" w:hAnsi="Arial" w:cs="Arial" w:eastAsia="Arial"/>
+          <w:rtl w:val="1"/>
+        </w:rPr>
+        <w:t>• اللقاء الأول: حوار له هدف</w:t>
+      </w:r>
+    </w:p>
+    <w:p>
+      <w:pPr>
+        <w:spacing w:after="60"/>
+        <w:ind w:right="198" w:hanging="142"/>
+        <w:jc w:val="right"/>
+        <w:bidi w:val="1"/>
+      </w:pPr>
+      <w:r>
+        <w:rPr>
+          <w:rFonts w:ascii="Arial" w:hAnsi="Arial" w:cs="Arial" w:eastAsia="Arial"/>
+          <w:rtl w:val="1"/>
+        </w:rPr>
+        <w:t>• اللقاء الثاني: نهاية تستجيب للبداية</w:t>
+      </w:r>
+    </w:p>
+    <w:p>
+      <w:pPr>
+        <w:spacing w:after="60"/>
+        <w:ind w:right="198" w:hanging="142"/>
+        <w:jc w:val="right"/>
+        <w:bidi w:val="1"/>
+      </w:pPr>
+      <w:r>
+        <w:rPr>
+          <w:rFonts w:ascii="Arial" w:hAnsi="Arial" w:cs="Arial" w:eastAsia="Arial"/>
+          <w:rtl w:val="1"/>
+        </w:rPr>
+        <w:t>• أنواع النهايات</w:t>
+      </w:r>
+    </w:p>
+    <w:p>
+      <w:pPr>
+        <w:spacing w:after="60"/>
+        <w:ind w:right="198" w:hanging="142"/>
+        <w:jc w:val="right"/>
+        <w:bidi w:val="1"/>
+      </w:pPr>
+      <w:r>
+        <w:rPr>
+          <w:rFonts w:ascii="Arial" w:hAnsi="Arial" w:cs="Arial" w:eastAsia="Arial"/>
+          <w:rtl w:val="1"/>
+        </w:rPr>
+        <w:t>• الحوار وعلاماته وإيقاعه</w:t>
+      </w:r>
+    </w:p>
+    <w:p>
+      <w:pPr>
+        <w:spacing w:after="60"/>
+        <w:ind w:right="198" w:hanging="142"/>
+        <w:jc w:val="right"/>
+        <w:bidi w:val="1"/>
+      </w:pPr>
+      <w:r>
+        <w:rPr>
+          <w:rFonts w:ascii="Arial" w:hAnsi="Arial" w:cs="Arial" w:eastAsia="Arial"/>
+          <w:rtl w:val="1"/>
+        </w:rPr>
+        <w:t>• بناء نهاية من خيط البداية</w:t>
+      </w:r>
+    </w:p>
+    <w:p>
+      <w:pPr>
+        <w:pStyle w:val="Heading3"/>
+        <w:jc w:val="right"/>
+        <w:bidi w:val="1"/>
+      </w:pPr>
+      <w:r>
+        <w:rPr>
+          <w:rFonts w:ascii="Arial" w:hAnsi="Arial" w:cs="Arial" w:eastAsia="Arial"/>
+          <w:rtl w:val="1"/>
+        </w:rPr>
+        <w:t>المستوى الرابع: أراجع وأنشر</w:t>
+      </w:r>
+    </w:p>
+    <w:p>
+      <w:pPr>
+        <w:spacing w:after="60"/>
+        <w:ind w:right="198" w:hanging="142"/>
+        <w:jc w:val="right"/>
+        <w:bidi w:val="1"/>
+      </w:pPr>
+      <w:r>
+        <w:rPr>
+          <w:rFonts w:ascii="Arial" w:hAnsi="Arial" w:cs="Arial" w:eastAsia="Arial"/>
+          <w:rtl w:val="1"/>
+        </w:rPr>
         <w:t>13. الوحدة الثامنة: المسودة والمراجعة والتحرير والنشر</w:t>
       </w:r>
     </w:p>
@@ -587,6 +1662,155 @@
           <w:rFonts w:ascii="Arial" w:hAnsi="Arial" w:cs="Arial" w:eastAsia="Arial"/>
           <w:rtl w:val="1"/>
         </w:rPr>
+        <w:t>• الكتابة على مراحل مرنة</w:t>
+      </w:r>
+    </w:p>
+    <w:p>
+      <w:pPr>
+        <w:spacing w:after="60"/>
+        <w:ind w:right="198" w:hanging="142"/>
+        <w:jc w:val="right"/>
+        <w:bidi w:val="1"/>
+      </w:pPr>
+      <w:r>
+        <w:rPr>
+          <w:rFonts w:ascii="Arial" w:hAnsi="Arial" w:cs="Arial" w:eastAsia="Arial"/>
+          <w:rtl w:val="1"/>
+        </w:rPr>
+        <w:t>• الفرق بين المراجعة والتحرير</w:t>
+      </w:r>
+    </w:p>
+    <w:p>
+      <w:pPr>
+        <w:spacing w:after="60"/>
+        <w:ind w:right="198" w:hanging="142"/>
+        <w:jc w:val="right"/>
+        <w:bidi w:val="1"/>
+      </w:pPr>
+      <w:r>
+        <w:rPr>
+          <w:rFonts w:ascii="Arial" w:hAnsi="Arial" w:cs="Arial" w:eastAsia="Arial"/>
+          <w:rtl w:val="1"/>
+        </w:rPr>
+        <w:t>• اللقاء الأول: المسودة من الخريطة</w:t>
+      </w:r>
+    </w:p>
+    <w:p>
+      <w:pPr>
+        <w:spacing w:after="60"/>
+        <w:ind w:right="198" w:hanging="142"/>
+        <w:jc w:val="right"/>
+        <w:bidi w:val="1"/>
+      </w:pPr>
+      <w:r>
+        <w:rPr>
+          <w:rFonts w:ascii="Arial" w:hAnsi="Arial" w:cs="Arial" w:eastAsia="Arial"/>
+          <w:rtl w:val="1"/>
+        </w:rPr>
+        <w:t>• اللقاء الثاني: مراجعة المعنى والترابط</w:t>
+      </w:r>
+    </w:p>
+    <w:p>
+      <w:pPr>
+        <w:spacing w:after="60"/>
+        <w:ind w:right="198" w:hanging="142"/>
+        <w:jc w:val="right"/>
+        <w:bidi w:val="1"/>
+      </w:pPr>
+      <w:r>
+        <w:rPr>
+          <w:rFonts w:ascii="Arial" w:hAnsi="Arial" w:cs="Arial" w:eastAsia="Arial"/>
+          <w:rtl w:val="1"/>
+        </w:rPr>
+        <w:t>• اللقاء الثالث: التحرير والمشاركة</w:t>
+      </w:r>
+    </w:p>
+    <w:p>
+      <w:pPr>
+        <w:spacing w:after="60"/>
+        <w:ind w:right="198" w:hanging="142"/>
+        <w:jc w:val="right"/>
+        <w:bidi w:val="1"/>
+      </w:pPr>
+      <w:r>
+        <w:rPr>
+          <w:rFonts w:ascii="Arial" w:hAnsi="Arial" w:cs="Arial" w:eastAsia="Arial"/>
+          <w:rtl w:val="1"/>
+        </w:rPr>
+        <w:t>• قائمة مراجعة الكاتب</w:t>
+      </w:r>
+    </w:p>
+    <w:p>
+      <w:pPr>
+        <w:spacing w:after="60"/>
+        <w:ind w:right="198" w:hanging="142"/>
+        <w:jc w:val="right"/>
+        <w:bidi w:val="1"/>
+      </w:pPr>
+      <w:r>
+        <w:rPr>
+          <w:rFonts w:ascii="Arial" w:hAnsi="Arial" w:cs="Arial" w:eastAsia="Arial"/>
+          <w:rtl w:val="1"/>
+        </w:rPr>
+        <w:t>• جولات المراجعة والقراءة الختامية</w:t>
+      </w:r>
+    </w:p>
+    <w:p>
+      <w:pPr>
+        <w:spacing w:after="60"/>
+        <w:ind w:right="198" w:hanging="142"/>
+        <w:jc w:val="right"/>
+        <w:bidi w:val="1"/>
+      </w:pPr>
+      <w:r>
+        <w:rPr>
+          <w:rFonts w:ascii="Arial" w:hAnsi="Arial" w:cs="Arial" w:eastAsia="Arial"/>
+          <w:rtl w:val="1"/>
+        </w:rPr>
+        <w:t>• مؤتمر الكاتب القصير</w:t>
+      </w:r>
+    </w:p>
+    <w:p>
+      <w:pPr>
+        <w:spacing w:after="60"/>
+        <w:ind w:right="198" w:hanging="142"/>
+        <w:jc w:val="right"/>
+        <w:bidi w:val="1"/>
+      </w:pPr>
+      <w:r>
+        <w:rPr>
+          <w:rFonts w:ascii="Arial" w:hAnsi="Arial" w:cs="Arial" w:eastAsia="Arial"/>
+          <w:rtl w:val="1"/>
+        </w:rPr>
+        <w:t>• أشكال مشاركة متنوعة</w:t>
+      </w:r>
+    </w:p>
+    <w:p>
+      <w:pPr>
+        <w:pStyle w:val="Heading3"/>
+        <w:jc w:val="right"/>
+        <w:bidi w:val="1"/>
+      </w:pPr>
+      <w:r>
+        <w:rPr>
+          <w:rFonts w:ascii="Arial" w:hAnsi="Arial" w:cs="Arial" w:eastAsia="Arial"/>
+          <w:rtl w:val="1"/>
+        </w:rPr>
+        <w:t>النماذج والخطة وأوراق العمل</w:t>
+      </w:r>
+    </w:p>
+    <w:p>
+      <w:pPr>
+        <w:spacing w:after="60"/>
+        <w:ind w:right="198" w:hanging="142"/>
+        <w:jc w:val="right"/>
+        <w:bidi w:val="1"/>
+      </w:pPr>
+      <w:r>
+        <w:rPr>
+          <w:rFonts w:ascii="Arial" w:hAnsi="Arial" w:cs="Arial" w:eastAsia="Arial"/>
+          <w:rtl w:val="1"/>
+        </w:rPr>
         <w:t>14. نموذج تطبيقي متكامل: آدم وجرس لولو الأزرق</w:t>
       </w:r>
     </w:p>
@@ -602,6 +1826,81 @@
           <w:rFonts w:ascii="Arial" w:hAnsi="Arial" w:cs="Arial" w:eastAsia="Arial"/>
           <w:rtl w:val="1"/>
         </w:rPr>
+        <w:t>• بذرة القصة وخريطتها</w:t>
+      </w:r>
+    </w:p>
+    <w:p>
+      <w:pPr>
+        <w:spacing w:after="60"/>
+        <w:ind w:right="198" w:hanging="142"/>
+        <w:jc w:val="right"/>
+        <w:bidi w:val="1"/>
+      </w:pPr>
+      <w:r>
+        <w:rPr>
+          <w:rFonts w:ascii="Arial" w:hAnsi="Arial" w:cs="Arial" w:eastAsia="Arial"/>
+          <w:rtl w:val="1"/>
+        </w:rPr>
+        <w:t>• القصة</w:t>
+      </w:r>
+    </w:p>
+    <w:p>
+      <w:pPr>
+        <w:spacing w:after="60"/>
+        <w:ind w:right="198" w:hanging="142"/>
+        <w:jc w:val="right"/>
+        <w:bidi w:val="1"/>
+      </w:pPr>
+      <w:r>
+        <w:rPr>
+          <w:rFonts w:ascii="Arial" w:hAnsi="Arial" w:cs="Arial" w:eastAsia="Arial"/>
+          <w:rtl w:val="1"/>
+        </w:rPr>
+        <w:t>• كيف نقرأها ككتّاب؟</w:t>
+      </w:r>
+    </w:p>
+    <w:p>
+      <w:pPr>
+        <w:spacing w:after="60"/>
+        <w:ind w:right="198" w:hanging="142"/>
+        <w:jc w:val="right"/>
+        <w:bidi w:val="1"/>
+      </w:pPr>
+      <w:r>
+        <w:rPr>
+          <w:rFonts w:ascii="Arial" w:hAnsi="Arial" w:cs="Arial" w:eastAsia="Arial"/>
+          <w:rtl w:val="1"/>
+        </w:rPr>
+        <w:t>• نقل المهارات إلى نوع قصصي آخر</w:t>
+      </w:r>
+    </w:p>
+    <w:p>
+      <w:pPr>
+        <w:spacing w:after="60"/>
+        <w:ind w:right="198" w:hanging="142"/>
+        <w:jc w:val="right"/>
+        <w:bidi w:val="1"/>
+      </w:pPr>
+      <w:r>
+        <w:rPr>
+          <w:rFonts w:ascii="Arial" w:hAnsi="Arial" w:cs="Arial" w:eastAsia="Arial"/>
+          <w:rtl w:val="1"/>
+        </w:rPr>
+        <w:t>• مثال على مسودة ثم مراجعة</w:t>
+      </w:r>
+    </w:p>
+    <w:p>
+      <w:pPr>
+        <w:spacing w:after="60"/>
+        <w:ind w:right="198" w:hanging="142"/>
+        <w:jc w:val="right"/>
+        <w:bidi w:val="1"/>
+      </w:pPr>
+      <w:r>
+        <w:rPr>
+          <w:rFonts w:ascii="Arial" w:hAnsi="Arial" w:cs="Arial" w:eastAsia="Arial"/>
+          <w:rtl w:val="1"/>
+        </w:rPr>
         <w:t>15. الخطة التنفيذية المقترحة: ستة عشر لقاءً</w:t>
       </w:r>
     </w:p>
@@ -617,6 +1916,141 @@
           <w:rFonts w:ascii="Arial" w:hAnsi="Arial" w:cs="Arial" w:eastAsia="Arial"/>
           <w:rtl w:val="1"/>
         </w:rPr>
+        <w:t>• الوحدة الأولى: اكتشاف الحكاية</w:t>
+      </w:r>
+    </w:p>
+    <w:p>
+      <w:pPr>
+        <w:spacing w:after="60"/>
+        <w:ind w:right="198" w:hanging="142"/>
+        <w:jc w:val="right"/>
+        <w:bidi w:val="1"/>
+      </w:pPr>
+      <w:r>
+        <w:rPr>
+          <w:rFonts w:ascii="Arial" w:hAnsi="Arial" w:cs="Arial" w:eastAsia="Arial"/>
+          <w:rtl w:val="1"/>
+        </w:rPr>
+        <w:t>• الوحدة الثانية: توليد الفكرة</w:t>
+      </w:r>
+    </w:p>
+    <w:p>
+      <w:pPr>
+        <w:spacing w:after="60"/>
+        <w:ind w:right="198" w:hanging="142"/>
+        <w:jc w:val="right"/>
+        <w:bidi w:val="1"/>
+      </w:pPr>
+      <w:r>
+        <w:rPr>
+          <w:rFonts w:ascii="Arial" w:hAnsi="Arial" w:cs="Arial" w:eastAsia="Arial"/>
+          <w:rtl w:val="1"/>
+        </w:rPr>
+        <w:t>• الوحدة الثالثة: الشخصية والهدف</w:t>
+      </w:r>
+    </w:p>
+    <w:p>
+      <w:pPr>
+        <w:spacing w:after="60"/>
+        <w:ind w:right="198" w:hanging="142"/>
+        <w:jc w:val="right"/>
+        <w:bidi w:val="1"/>
+      </w:pPr>
+      <w:r>
+        <w:rPr>
+          <w:rFonts w:ascii="Arial" w:hAnsi="Arial" w:cs="Arial" w:eastAsia="Arial"/>
+          <w:rtl w:val="1"/>
+        </w:rPr>
+        <w:t>• الوحدة الرابعة: المكان والوصف</w:t>
+      </w:r>
+    </w:p>
+    <w:p>
+      <w:pPr>
+        <w:spacing w:after="60"/>
+        <w:ind w:right="198" w:hanging="142"/>
+        <w:jc w:val="right"/>
+        <w:bidi w:val="1"/>
+      </w:pPr>
+      <w:r>
+        <w:rPr>
+          <w:rFonts w:ascii="Arial" w:hAnsi="Arial" w:cs="Arial" w:eastAsia="Arial"/>
+          <w:rtl w:val="1"/>
+        </w:rPr>
+        <w:t>• الوحدة الخامسة: الحبكة</w:t>
+      </w:r>
+    </w:p>
+    <w:p>
+      <w:pPr>
+        <w:spacing w:after="60"/>
+        <w:ind w:right="198" w:hanging="142"/>
+        <w:jc w:val="right"/>
+        <w:bidi w:val="1"/>
+      </w:pPr>
+      <w:r>
+        <w:rPr>
+          <w:rFonts w:ascii="Arial" w:hAnsi="Arial" w:cs="Arial" w:eastAsia="Arial"/>
+          <w:rtl w:val="1"/>
+        </w:rPr>
+        <w:t>• الوحدة السادسة: البداية والراوي</w:t>
+      </w:r>
+    </w:p>
+    <w:p>
+      <w:pPr>
+        <w:spacing w:after="60"/>
+        <w:ind w:right="198" w:hanging="142"/>
+        <w:jc w:val="right"/>
+        <w:bidi w:val="1"/>
+      </w:pPr>
+      <w:r>
+        <w:rPr>
+          <w:rFonts w:ascii="Arial" w:hAnsi="Arial" w:cs="Arial" w:eastAsia="Arial"/>
+          <w:rtl w:val="1"/>
+        </w:rPr>
+        <w:t>• الوحدة السابعة: السرد والحوار والنهاية</w:t>
+      </w:r>
+    </w:p>
+    <w:p>
+      <w:pPr>
+        <w:spacing w:after="60"/>
+        <w:ind w:right="198" w:hanging="142"/>
+        <w:jc w:val="right"/>
+        <w:bidi w:val="1"/>
+      </w:pPr>
+      <w:r>
+        <w:rPr>
+          <w:rFonts w:ascii="Arial" w:hAnsi="Arial" w:cs="Arial" w:eastAsia="Arial"/>
+          <w:rtl w:val="1"/>
+        </w:rPr>
+        <w:t>• الوحدة الثامنة: المسودة والمراجعة والنشر</w:t>
+      </w:r>
+    </w:p>
+    <w:p>
+      <w:pPr>
+        <w:spacing w:after="60"/>
+        <w:ind w:right="198" w:hanging="142"/>
+        <w:jc w:val="right"/>
+        <w:bidi w:val="1"/>
+      </w:pPr>
+      <w:r>
+        <w:rPr>
+          <w:rFonts w:ascii="Arial" w:hAnsi="Arial" w:cs="Arial" w:eastAsia="Arial"/>
+          <w:rtl w:val="1"/>
+        </w:rPr>
+        <w:t>• إذا لم يتوفر إلا ثمانية لقاءات</w:t>
+      </w:r>
+    </w:p>
+    <w:p>
+      <w:pPr>
+        <w:spacing w:after="60"/>
+        <w:ind w:right="198" w:hanging="142"/>
+        <w:jc w:val="right"/>
+        <w:bidi w:val="1"/>
+      </w:pPr>
+      <w:r>
+        <w:rPr>
+          <w:rFonts w:ascii="Arial" w:hAnsi="Arial" w:cs="Arial" w:eastAsia="Arial"/>
+          <w:rtl w:val="1"/>
+        </w:rPr>
         <w:t>16. أوراق عمل قابلة للطباعة</w:t>
       </w:r>
     </w:p>
@@ -632,6 +2066,95 @@
           <w:rFonts w:ascii="Arial" w:hAnsi="Arial" w:cs="Arial" w:eastAsia="Arial"/>
           <w:rtl w:val="1"/>
         </w:rPr>
+        <w:t>• الورقة أ: خريطة الحكاية الأولى</w:t>
+      </w:r>
+    </w:p>
+    <w:p>
+      <w:pPr>
+        <w:spacing w:after="60"/>
+        <w:ind w:right="198" w:hanging="142"/>
+        <w:jc w:val="right"/>
+        <w:bidi w:val="1"/>
+      </w:pPr>
+      <w:r>
+        <w:rPr>
+          <w:rFonts w:ascii="Arial" w:hAnsi="Arial" w:cs="Arial" w:eastAsia="Arial"/>
+          <w:rtl w:val="1"/>
+        </w:rPr>
+        <w:t>• الورقة ج: بطاقة الشخصية</w:t>
+      </w:r>
+    </w:p>
+    <w:p>
+      <w:pPr>
+        <w:spacing w:after="60"/>
+        <w:ind w:right="198" w:hanging="142"/>
+        <w:jc w:val="right"/>
+        <w:bidi w:val="1"/>
+      </w:pPr>
+      <w:r>
+        <w:rPr>
+          <w:rFonts w:ascii="Arial" w:hAnsi="Arial" w:cs="Arial" w:eastAsia="Arial"/>
+          <w:rtl w:val="1"/>
+        </w:rPr>
+        <w:t>• الورقة هـ: خريطة الحبكة</w:t>
+      </w:r>
+    </w:p>
+    <w:p>
+      <w:pPr>
+        <w:spacing w:after="60"/>
+        <w:ind w:right="198" w:hanging="142"/>
+        <w:jc w:val="right"/>
+        <w:bidi w:val="1"/>
+      </w:pPr>
+      <w:r>
+        <w:rPr>
+          <w:rFonts w:ascii="Arial" w:hAnsi="Arial" w:cs="Arial" w:eastAsia="Arial"/>
+          <w:rtl w:val="1"/>
+        </w:rPr>
+        <w:t>• الورقة ح: مراجعة القصة</w:t>
+      </w:r>
+    </w:p>
+    <w:p>
+      <w:pPr>
+        <w:spacing w:after="60"/>
+        <w:ind w:right="198" w:hanging="142"/>
+        <w:jc w:val="right"/>
+        <w:bidi w:val="1"/>
+      </w:pPr>
+      <w:r>
+        <w:rPr>
+          <w:rFonts w:ascii="Arial" w:hAnsi="Arial" w:cs="Arial" w:eastAsia="Arial"/>
+          <w:rtl w:val="1"/>
+        </w:rPr>
+        <w:t>• أدوات إضافية للميسّر: خطة اللقاء وسجل التقدم</w:t>
+      </w:r>
+    </w:p>
+    <w:p>
+      <w:pPr>
+        <w:pStyle w:val="Heading3"/>
+        <w:jc w:val="right"/>
+        <w:bidi w:val="1"/>
+      </w:pPr>
+      <w:r>
+        <w:rPr>
+          <w:rFonts w:ascii="Arial" w:hAnsi="Arial" w:cs="Arial" w:eastAsia="Arial"/>
+          <w:rtl w:val="1"/>
+        </w:rPr>
+        <w:t>المساندة والموارد</w:t>
+      </w:r>
+    </w:p>
+    <w:p>
+      <w:pPr>
+        <w:spacing w:after="60"/>
+        <w:ind w:right="198" w:hanging="142"/>
+        <w:jc w:val="right"/>
+        <w:bidi w:val="1"/>
+      </w:pPr>
+      <w:r>
+        <w:rPr>
+          <w:rFonts w:ascii="Arial" w:hAnsi="Arial" w:cs="Arial" w:eastAsia="Arial"/>
+          <w:rtl w:val="1"/>
+        </w:rPr>
         <w:t>17. التمايز ودعم المتعلمين</w:t>
       </w:r>
     </w:p>
@@ -647,7 +2170,202 @@
           <w:rFonts w:ascii="Arial" w:hAnsi="Arial" w:cs="Arial" w:eastAsia="Arial"/>
           <w:rtl w:val="1"/>
         </w:rPr>
+        <w:t>• للطفل المبتدئ في الكتابة</w:t>
+      </w:r>
+    </w:p>
+    <w:p>
+      <w:pPr>
+        <w:spacing w:after="60"/>
+        <w:ind w:right="198" w:hanging="142"/>
+        <w:jc w:val="right"/>
+        <w:bidi w:val="1"/>
+      </w:pPr>
+      <w:r>
+        <w:rPr>
+          <w:rFonts w:ascii="Arial" w:hAnsi="Arial" w:cs="Arial" w:eastAsia="Arial"/>
+          <w:rtl w:val="1"/>
+        </w:rPr>
+        <w:t>• للطفل الذي يحتاج إلى دعم لغوي</w:t>
+      </w:r>
+    </w:p>
+    <w:p>
+      <w:pPr>
+        <w:spacing w:after="60"/>
+        <w:ind w:right="198" w:hanging="142"/>
+        <w:jc w:val="right"/>
+        <w:bidi w:val="1"/>
+      </w:pPr>
+      <w:r>
+        <w:rPr>
+          <w:rFonts w:ascii="Arial" w:hAnsi="Arial" w:cs="Arial" w:eastAsia="Arial"/>
+          <w:rtl w:val="1"/>
+        </w:rPr>
+        <w:t>• للطفل الذي يحتاج إلى دعم في القراءة أو الكتابة اليدوية</w:t>
+      </w:r>
+    </w:p>
+    <w:p>
+      <w:pPr>
+        <w:spacing w:after="60"/>
+        <w:ind w:right="198" w:hanging="142"/>
+        <w:jc w:val="right"/>
+        <w:bidi w:val="1"/>
+      </w:pPr>
+      <w:r>
+        <w:rPr>
+          <w:rFonts w:ascii="Arial" w:hAnsi="Arial" w:cs="Arial" w:eastAsia="Arial"/>
+          <w:rtl w:val="1"/>
+        </w:rPr>
+        <w:t>• للكاتب المتقدم</w:t>
+      </w:r>
+    </w:p>
+    <w:p>
+      <w:pPr>
+        <w:spacing w:after="60"/>
+        <w:ind w:right="198" w:hanging="142"/>
+        <w:jc w:val="right"/>
+        <w:bidi w:val="1"/>
+      </w:pPr>
+      <w:r>
+        <w:rPr>
+          <w:rFonts w:ascii="Arial" w:hAnsi="Arial" w:cs="Arial" w:eastAsia="Arial"/>
+          <w:rtl w:val="1"/>
+        </w:rPr>
+        <w:t>• للطفل المتردد في المشاركة</w:t>
+      </w:r>
+    </w:p>
+    <w:p>
+      <w:pPr>
+        <w:spacing w:after="60"/>
+        <w:ind w:right="198" w:hanging="142"/>
+        <w:jc w:val="right"/>
+        <w:bidi w:val="1"/>
+      </w:pPr>
+      <w:r>
+        <w:rPr>
+          <w:rFonts w:ascii="Arial" w:hAnsi="Arial" w:cs="Arial" w:eastAsia="Arial"/>
+          <w:rtl w:val="1"/>
+        </w:rPr>
         <w:t>18. مواقف صفية واستجابات الميسّر</w:t>
+      </w:r>
+    </w:p>
+    <w:p>
+      <w:pPr>
+        <w:spacing w:after="60"/>
+        <w:ind w:right="198" w:hanging="142"/>
+        <w:jc w:val="right"/>
+        <w:bidi w:val="1"/>
+      </w:pPr>
+      <w:r>
+        <w:rPr>
+          <w:rFonts w:ascii="Arial" w:hAnsi="Arial" w:cs="Arial" w:eastAsia="Arial"/>
+          <w:rtl w:val="1"/>
+        </w:rPr>
+        <w:t>• «لا أعرف ماذا أكتب»</w:t>
+      </w:r>
+    </w:p>
+    <w:p>
+      <w:pPr>
+        <w:spacing w:after="60"/>
+        <w:ind w:right="198" w:hanging="142"/>
+        <w:jc w:val="right"/>
+        <w:bidi w:val="1"/>
+      </w:pPr>
+      <w:r>
+        <w:rPr>
+          <w:rFonts w:ascii="Arial" w:hAnsi="Arial" w:cs="Arial" w:eastAsia="Arial"/>
+          <w:rtl w:val="1"/>
+        </w:rPr>
+        <w:t>• يكتب الطفل وصفًا بلا أحداث</w:t>
+      </w:r>
+    </w:p>
+    <w:p>
+      <w:pPr>
+        <w:spacing w:after="60"/>
+        <w:ind w:right="198" w:hanging="142"/>
+        <w:jc w:val="right"/>
+        <w:bidi w:val="1"/>
+      </w:pPr>
+      <w:r>
+        <w:rPr>
+          <w:rFonts w:ascii="Arial" w:hAnsi="Arial" w:cs="Arial" w:eastAsia="Arial"/>
+          <w:rtl w:val="1"/>
+        </w:rPr>
+        <w:t>• الأحداث متجاورة بلا رابط</w:t>
+      </w:r>
+    </w:p>
+    <w:p>
+      <w:pPr>
+        <w:spacing w:after="60"/>
+        <w:ind w:right="198" w:hanging="142"/>
+        <w:jc w:val="right"/>
+        <w:bidi w:val="1"/>
+      </w:pPr>
+      <w:r>
+        <w:rPr>
+          <w:rFonts w:ascii="Arial" w:hAnsi="Arial" w:cs="Arial" w:eastAsia="Arial"/>
+          <w:rtl w:val="1"/>
+        </w:rPr>
+        <w:t>• حل مفاجئ بلا تمهيد</w:t>
+      </w:r>
+    </w:p>
+    <w:p>
+      <w:pPr>
+        <w:spacing w:after="60"/>
+        <w:ind w:right="198" w:hanging="142"/>
+        <w:jc w:val="right"/>
+        <w:bidi w:val="1"/>
+      </w:pPr>
+      <w:r>
+        <w:rPr>
+          <w:rFonts w:ascii="Arial" w:hAnsi="Arial" w:cs="Arial" w:eastAsia="Arial"/>
+          <w:rtl w:val="1"/>
+        </w:rPr>
+        <w:t>• الطفل يطلب تصحيح كل كلمة</w:t>
+      </w:r>
+    </w:p>
+    <w:p>
+      <w:pPr>
+        <w:spacing w:after="60"/>
+        <w:ind w:right="198" w:hanging="142"/>
+        <w:jc w:val="right"/>
+        <w:bidi w:val="1"/>
+      </w:pPr>
+      <w:r>
+        <w:rPr>
+          <w:rFonts w:ascii="Arial" w:hAnsi="Arial" w:cs="Arial" w:eastAsia="Arial"/>
+          <w:rtl w:val="1"/>
+        </w:rPr>
+        <w:t>• الطفل لا يريد قراءة عمله</w:t>
+      </w:r>
+    </w:p>
+    <w:p>
+      <w:pPr>
+        <w:spacing w:after="60"/>
+        <w:ind w:right="198" w:hanging="142"/>
+        <w:jc w:val="right"/>
+        <w:bidi w:val="1"/>
+      </w:pPr>
+      <w:r>
+        <w:rPr>
+          <w:rFonts w:ascii="Arial" w:hAnsi="Arial" w:cs="Arial" w:eastAsia="Arial"/>
+          <w:rtl w:val="1"/>
+        </w:rPr>
+        <w:t>• تعليق جارح من زميل</w:t>
+      </w:r>
+    </w:p>
+    <w:p>
+      <w:pPr>
+        <w:spacing w:after="60"/>
+        <w:ind w:right="198" w:hanging="142"/>
+        <w:jc w:val="right"/>
+        <w:bidi w:val="1"/>
+      </w:pPr>
+      <w:r>
+        <w:rPr>
+          <w:rFonts w:ascii="Arial" w:hAnsi="Arial" w:cs="Arial" w:eastAsia="Arial"/>
+          <w:rtl w:val="1"/>
+        </w:rPr>
+        <w:t>• اختلاف اللهجة والفصحى</w:t>
       </w:r>
     </w:p>
     <w:p>
@@ -2350,6 +4068,226 @@
           <w:rFonts w:ascii="Arial" w:hAnsi="Arial" w:cs="Arial" w:eastAsia="Arial"/>
           <w:rtl w:val="1"/>
         </w:rPr>
+        <w:t>رصيد لغوي يساعد الكاتب</w:t>
+      </w:r>
+    </w:p>
+    <w:p>
+      <w:pPr>
+        <w:jc w:val="right"/>
+        <w:widowControl/>
+        <w:bidi w:val="1"/>
+      </w:pPr>
+      <w:r>
+        <w:rPr>
+          <w:rFonts w:ascii="Arial" w:hAnsi="Arial" w:cs="Arial" w:eastAsia="Arial"/>
+          <w:rtl w:val="1"/>
+        </w:rPr>
+        <w:t>الكلمات ليست زينة تضاف بعد اكتمال القصة؛ إنها أدوات تساعد الطفل على تسمية ما يراه ويفعله ويفكر فيه. لا يلزم تقديم قائمة طويلة للحفظ. اجمعوا الكلمات أثناء القراءة والكتابة، ثم صنفوها بحسب ما يحتاجه الكاتب:</w:t>
+      </w:r>
+    </w:p>
+    <w:p>
+      <w:pPr>
+        <w:spacing w:after="60"/>
+        <w:ind w:right="198" w:hanging="142"/>
+        <w:jc w:val="right"/>
+        <w:bidi w:val="1"/>
+      </w:pPr>
+      <w:r>
+        <w:rPr>
+          <w:rFonts w:ascii="Arial" w:hAnsi="Arial" w:cs="Arial" w:eastAsia="Arial"/>
+          <w:rtl w:val="1"/>
+        </w:rPr>
+        <w:t xml:space="preserve">• </w:t>
+      </w:r>
+      <w:r>
+        <w:rPr>
+          <w:rFonts w:ascii="Arial" w:hAnsi="Arial" w:cs="Arial" w:eastAsia="Arial"/>
+          <w:b/>
+          <w:rtl w:val="1"/>
+        </w:rPr>
+        <w:t>أفعال الحركة:</w:t>
+      </w:r>
+      <w:r>
+        <w:rPr>
+          <w:rFonts w:ascii="Arial" w:hAnsi="Arial" w:cs="Arial" w:eastAsia="Arial"/>
+          <w:rtl w:val="1"/>
+        </w:rPr>
+        <w:t xml:space="preserve"> اقترب، ابتعد، توقف، التفت، تعثر، تسلق.</w:t>
+      </w:r>
+    </w:p>
+    <w:p>
+      <w:pPr>
+        <w:spacing w:after="60"/>
+        <w:ind w:right="198" w:hanging="142"/>
+        <w:jc w:val="right"/>
+        <w:bidi w:val="1"/>
+      </w:pPr>
+      <w:r>
+        <w:rPr>
+          <w:rFonts w:ascii="Arial" w:hAnsi="Arial" w:cs="Arial" w:eastAsia="Arial"/>
+          <w:rtl w:val="1"/>
+        </w:rPr>
+        <w:t xml:space="preserve">• </w:t>
+      </w:r>
+      <w:r>
+        <w:rPr>
+          <w:rFonts w:ascii="Arial" w:hAnsi="Arial" w:cs="Arial" w:eastAsia="Arial"/>
+          <w:b/>
+          <w:rtl w:val="1"/>
+        </w:rPr>
+        <w:t>أفعال الملاحظة:</w:t>
+      </w:r>
+      <w:r>
+        <w:rPr>
+          <w:rFonts w:ascii="Arial" w:hAnsi="Arial" w:cs="Arial" w:eastAsia="Arial"/>
+          <w:rtl w:val="1"/>
+        </w:rPr>
+        <w:t xml:space="preserve"> لمح، أصغى، انتبه، لاحظ، تتبع.</w:t>
+      </w:r>
+    </w:p>
+    <w:p>
+      <w:pPr>
+        <w:spacing w:after="60"/>
+        <w:ind w:right="198" w:hanging="142"/>
+        <w:jc w:val="right"/>
+        <w:bidi w:val="1"/>
+      </w:pPr>
+      <w:r>
+        <w:rPr>
+          <w:rFonts w:ascii="Arial" w:hAnsi="Arial" w:cs="Arial" w:eastAsia="Arial"/>
+          <w:rtl w:val="1"/>
+        </w:rPr>
+        <w:t xml:space="preserve">• </w:t>
+      </w:r>
+      <w:r>
+        <w:rPr>
+          <w:rFonts w:ascii="Arial" w:hAnsi="Arial" w:cs="Arial" w:eastAsia="Arial"/>
+          <w:b/>
+          <w:rtl w:val="1"/>
+        </w:rPr>
+        <w:t>أفعال القول:</w:t>
+      </w:r>
+      <w:r>
+        <w:rPr>
+          <w:rFonts w:ascii="Arial" w:hAnsi="Arial" w:cs="Arial" w:eastAsia="Arial"/>
+          <w:rtl w:val="1"/>
+        </w:rPr>
+        <w:t xml:space="preserve"> سأل، همس، أجاب، نادى، اعترض، اقترح.</w:t>
+      </w:r>
+    </w:p>
+    <w:p>
+      <w:pPr>
+        <w:spacing w:after="60"/>
+        <w:ind w:right="198" w:hanging="142"/>
+        <w:jc w:val="right"/>
+        <w:bidi w:val="1"/>
+      </w:pPr>
+      <w:r>
+        <w:rPr>
+          <w:rFonts w:ascii="Arial" w:hAnsi="Arial" w:cs="Arial" w:eastAsia="Arial"/>
+          <w:rtl w:val="1"/>
+        </w:rPr>
+        <w:t xml:space="preserve">• </w:t>
+      </w:r>
+      <w:r>
+        <w:rPr>
+          <w:rFonts w:ascii="Arial" w:hAnsi="Arial" w:cs="Arial" w:eastAsia="Arial"/>
+          <w:b/>
+          <w:rtl w:val="1"/>
+        </w:rPr>
+        <w:t>أفعال الانفعال:</w:t>
+      </w:r>
+      <w:r>
+        <w:rPr>
+          <w:rFonts w:ascii="Arial" w:hAnsi="Arial" w:cs="Arial" w:eastAsia="Arial"/>
+          <w:rtl w:val="1"/>
+        </w:rPr>
+        <w:t xml:space="preserve"> تردد، ابتسم، تنهد، ارتجف، هدأ.</w:t>
+      </w:r>
+    </w:p>
+    <w:p>
+      <w:pPr>
+        <w:spacing w:after="60"/>
+        <w:ind w:right="198" w:hanging="142"/>
+        <w:jc w:val="right"/>
+        <w:bidi w:val="1"/>
+      </w:pPr>
+      <w:r>
+        <w:rPr>
+          <w:rFonts w:ascii="Arial" w:hAnsi="Arial" w:cs="Arial" w:eastAsia="Arial"/>
+          <w:rtl w:val="1"/>
+        </w:rPr>
+        <w:t xml:space="preserve">• </w:t>
+      </w:r>
+      <w:r>
+        <w:rPr>
+          <w:rFonts w:ascii="Arial" w:hAnsi="Arial" w:cs="Arial" w:eastAsia="Arial"/>
+          <w:b/>
+          <w:rtl w:val="1"/>
+        </w:rPr>
+        <w:t>روابط الحكاية:</w:t>
+      </w:r>
+      <w:r>
+        <w:rPr>
+          <w:rFonts w:ascii="Arial" w:hAnsi="Arial" w:cs="Arial" w:eastAsia="Arial"/>
+          <w:rtl w:val="1"/>
+        </w:rPr>
+        <w:t xml:space="preserve"> في البداية، بعد قليل، لأن، لكن، لذلك، في النهاية.</w:t>
+      </w:r>
+    </w:p>
+    <w:p>
+      <w:pPr>
+        <w:jc w:val="right"/>
+        <w:widowControl/>
+        <w:bidi w:val="1"/>
+      </w:pPr>
+      <w:r>
+        <w:rPr>
+          <w:rFonts w:ascii="Arial" w:hAnsi="Arial" w:cs="Arial" w:eastAsia="Arial"/>
+          <w:rtl w:val="1"/>
+        </w:rPr>
+        <w:t>يعرض الميسّر ثلاث كلمات فقط في الدرس، ويضع كل واحدة في جملة. ثم يطلب من الطفل اختيار كلمة تخدم مشهده أو الاحتفاظ بكلمته الخاصة إذا كانت أوضح. إذا كتب الطفل «مشى»، يمكن أن يسأله: «هل سار بهدوء، أم ركض، أم تراجع؟» ليختار الفعل الذي يصف الحركة التي يقصدها.</w:t>
+      </w:r>
+    </w:p>
+    <w:p>
+      <w:pPr>
+        <w:pStyle w:val="Heading2"/>
+        <w:jc w:val="right"/>
+        <w:bidi w:val="1"/>
+      </w:pPr>
+      <w:r>
+        <w:rPr>
+          <w:rFonts w:ascii="Arial" w:hAnsi="Arial" w:cs="Arial" w:eastAsia="Arial"/>
+          <w:rtl w:val="1"/>
+        </w:rPr>
+        <w:t>من الكلمة إلى الفقرة</w:t>
+      </w:r>
+    </w:p>
+    <w:p>
+      <w:pPr>
+        <w:jc w:val="right"/>
+        <w:widowControl/>
+        <w:bidi w:val="1"/>
+      </w:pPr>
+      <w:r>
+        <w:rPr>
+          <w:rFonts w:ascii="Arial" w:hAnsi="Arial" w:cs="Arial" w:eastAsia="Arial"/>
+          <w:rtl w:val="1"/>
+        </w:rPr>
+        <w:t>تدريب قصير من أربع درجات: يسمّي الطفل غرضًا، ويختار فعلًا يصفه، ثم يبني جملة توضح ما حدث، وبعدها يربطها بجملة تالية بسبب أو نتيجة. مثال: «جرس»؛ «رنّ»؛ «رنّ الجرس قرب الباب»؛ «رنّ الجرس قرب الباب، لذلك التفت آدم إلى المخزن». يكتشف الطفل أن الكلمة الجديدة تعمل داخل معنى، لا في قائمة منفصلة.</w:t>
+      </w:r>
+    </w:p>
+    <w:p>
+      <w:pPr>
+        <w:pStyle w:val="Heading2"/>
+        <w:jc w:val="right"/>
+        <w:bidi w:val="1"/>
+      </w:pPr>
+      <w:r>
+        <w:rPr>
+          <w:rFonts w:ascii="Arial" w:hAnsi="Arial" w:cs="Arial" w:eastAsia="Arial"/>
+          <w:rtl w:val="1"/>
+        </w:rPr>
         <w:t>اتفاق المجموعة</w:t>
       </w:r>
     </w:p>
@@ -3510,6 +5448,196 @@
           <w:rFonts w:ascii="Arial" w:hAnsi="Arial" w:cs="Arial" w:eastAsia="Arial"/>
           <w:rtl w:val="1"/>
         </w:rPr>
+        <w:t>أسئلة متابعة تكشف فهم الحكاية</w:t>
+      </w:r>
+    </w:p>
+    <w:p>
+      <w:pPr>
+        <w:jc w:val="right"/>
+        <w:widowControl/>
+        <w:bidi w:val="1"/>
+      </w:pPr>
+      <w:r>
+        <w:rPr>
+          <w:rFonts w:ascii="Arial" w:hAnsi="Arial" w:cs="Arial" w:eastAsia="Arial"/>
+          <w:rtl w:val="1"/>
+        </w:rPr>
+        <w:t>يختار الميسّر سؤالًا واحدًا من كل مستوى بدل طرح أسئلة كثيرة في وقت واحد:</w:t>
+      </w:r>
+    </w:p>
+    <w:p>
+      <w:pPr>
+        <w:spacing w:after="60"/>
+        <w:ind w:right="198" w:hanging="142"/>
+        <w:jc w:val="right"/>
+        <w:bidi w:val="1"/>
+      </w:pPr>
+      <w:r>
+        <w:rPr>
+          <w:rFonts w:ascii="Arial" w:hAnsi="Arial" w:cs="Arial" w:eastAsia="Arial"/>
+          <w:rtl w:val="1"/>
+        </w:rPr>
+        <w:t xml:space="preserve">• </w:t>
+      </w:r>
+      <w:r>
+        <w:rPr>
+          <w:rFonts w:ascii="Arial" w:hAnsi="Arial" w:cs="Arial" w:eastAsia="Arial"/>
+          <w:b/>
+          <w:rtl w:val="1"/>
+        </w:rPr>
+        <w:t>التذكر:</w:t>
+      </w:r>
+      <w:r>
+        <w:rPr>
+          <w:rFonts w:ascii="Arial" w:hAnsi="Arial" w:cs="Arial" w:eastAsia="Arial"/>
+          <w:rtl w:val="1"/>
+        </w:rPr>
+        <w:t xml:space="preserve"> من الشخصية؟ وأين بدأت الحكاية؟</w:t>
+      </w:r>
+    </w:p>
+    <w:p>
+      <w:pPr>
+        <w:spacing w:after="60"/>
+        <w:ind w:right="198" w:hanging="142"/>
+        <w:jc w:val="right"/>
+        <w:bidi w:val="1"/>
+      </w:pPr>
+      <w:r>
+        <w:rPr>
+          <w:rFonts w:ascii="Arial" w:hAnsi="Arial" w:cs="Arial" w:eastAsia="Arial"/>
+          <w:rtl w:val="1"/>
+        </w:rPr>
+        <w:t xml:space="preserve">• </w:t>
+      </w:r>
+      <w:r>
+        <w:rPr>
+          <w:rFonts w:ascii="Arial" w:hAnsi="Arial" w:cs="Arial" w:eastAsia="Arial"/>
+          <w:b/>
+          <w:rtl w:val="1"/>
+        </w:rPr>
+        <w:t>التسلسل:</w:t>
+      </w:r>
+      <w:r>
+        <w:rPr>
+          <w:rFonts w:ascii="Arial" w:hAnsi="Arial" w:cs="Arial" w:eastAsia="Arial"/>
+          <w:rtl w:val="1"/>
+        </w:rPr>
+        <w:t xml:space="preserve"> ما الحدث الذي وقع أولًا؟ وما الذي جاء بعده؟</w:t>
+      </w:r>
+    </w:p>
+    <w:p>
+      <w:pPr>
+        <w:spacing w:after="60"/>
+        <w:ind w:right="198" w:hanging="142"/>
+        <w:jc w:val="right"/>
+        <w:bidi w:val="1"/>
+      </w:pPr>
+      <w:r>
+        <w:rPr>
+          <w:rFonts w:ascii="Arial" w:hAnsi="Arial" w:cs="Arial" w:eastAsia="Arial"/>
+          <w:rtl w:val="1"/>
+        </w:rPr>
+        <w:t xml:space="preserve">• </w:t>
+      </w:r>
+      <w:r>
+        <w:rPr>
+          <w:rFonts w:ascii="Arial" w:hAnsi="Arial" w:cs="Arial" w:eastAsia="Arial"/>
+          <w:b/>
+          <w:rtl w:val="1"/>
+        </w:rPr>
+        <w:t>السبب:</w:t>
+      </w:r>
+      <w:r>
+        <w:rPr>
+          <w:rFonts w:ascii="Arial" w:hAnsi="Arial" w:cs="Arial" w:eastAsia="Arial"/>
+          <w:rtl w:val="1"/>
+        </w:rPr>
+        <w:t xml:space="preserve"> لماذا قامت الشخصية بهذا الفعل؟ وما الدليل في النص؟</w:t>
+      </w:r>
+    </w:p>
+    <w:p>
+      <w:pPr>
+        <w:spacing w:after="60"/>
+        <w:ind w:right="198" w:hanging="142"/>
+        <w:jc w:val="right"/>
+        <w:bidi w:val="1"/>
+      </w:pPr>
+      <w:r>
+        <w:rPr>
+          <w:rFonts w:ascii="Arial" w:hAnsi="Arial" w:cs="Arial" w:eastAsia="Arial"/>
+          <w:rtl w:val="1"/>
+        </w:rPr>
+        <w:t xml:space="preserve">• </w:t>
+      </w:r>
+      <w:r>
+        <w:rPr>
+          <w:rFonts w:ascii="Arial" w:hAnsi="Arial" w:cs="Arial" w:eastAsia="Arial"/>
+          <w:b/>
+          <w:rtl w:val="1"/>
+        </w:rPr>
+        <w:t>التغيير:</w:t>
+      </w:r>
+      <w:r>
+        <w:rPr>
+          <w:rFonts w:ascii="Arial" w:hAnsi="Arial" w:cs="Arial" w:eastAsia="Arial"/>
+          <w:rtl w:val="1"/>
+        </w:rPr>
+        <w:t xml:space="preserve"> ما الذي أصبح مختلفًا في النهاية؟</w:t>
+      </w:r>
+    </w:p>
+    <w:p>
+      <w:pPr>
+        <w:jc w:val="right"/>
+        <w:widowControl/>
+        <w:bidi w:val="1"/>
+      </w:pPr>
+      <w:r>
+        <w:rPr>
+          <w:rFonts w:ascii="Arial" w:hAnsi="Arial" w:cs="Arial" w:eastAsia="Arial"/>
+          <w:rtl w:val="1"/>
+        </w:rPr>
+        <w:t>إذا أجاب الطفل بكلمة واحدة، يمكن للميسّر أن يعيدها في جملة ثم يطلب منه أن يكمل: «آدم في الحديقة، وبعدها…». وإذا اختلف طفلان في تفسير سبب الحدث، لا يحسم الميسّر الإجابة فورًا؛ يطلب منهما الإشارة إلى كلمة أو صورة تسند كل احتمال. هكذا يتعلم الطفل أن القراءة والتأليف عمليتا ملاحظة وتفسير، لا تخمينًا لما يريده المعلم.</w:t>
+      </w:r>
+    </w:p>
+    <w:p>
+      <w:pPr>
+        <w:pStyle w:val="Heading2"/>
+        <w:jc w:val="right"/>
+        <w:bidi w:val="1"/>
+      </w:pPr>
+      <w:r>
+        <w:rPr>
+          <w:rFonts w:ascii="Arial" w:hAnsi="Arial" w:cs="Arial" w:eastAsia="Arial"/>
+          <w:rtl w:val="1"/>
+        </w:rPr>
+        <w:t>من الحكي إلى أثر مكتوب</w:t>
+      </w:r>
+    </w:p>
+    <w:p>
+      <w:pPr>
+        <w:jc w:val="right"/>
+        <w:widowControl/>
+        <w:bidi w:val="1"/>
+      </w:pPr>
+      <w:r>
+        <w:rPr>
+          <w:rFonts w:ascii="Arial" w:hAnsi="Arial" w:cs="Arial" w:eastAsia="Arial"/>
+          <w:rtl w:val="1"/>
+        </w:rPr>
+        <w:t>لا تنتقل بالمجموعة من الاستماع إلى قصة طويلة من دون جسر. ابدأ بإعادة الحكي شفهيًا، ثم دوّن كلمات مفتاحية، ثم حوّل كلمة أو كلمتين إلى جمل. للطفل الذي لا يكتب مستقلًا، يمكن أن يملي الجملة ويختار علامة أو كلمة بنفسه. وللكاتب المتقدم، اطلب أن يروي الحدث نفسه من منظور شخصية أخرى، ثم ناقش ما الذي عرفه القارئ أو لم يعرفه.</w:t>
+      </w:r>
+    </w:p>
+    <w:p>
+      <w:pPr>
+        <w:pStyle w:val="Heading2"/>
+        <w:jc w:val="right"/>
+        <w:bidi w:val="1"/>
+      </w:pPr>
+      <w:r>
+        <w:rPr>
+          <w:rFonts w:ascii="Arial" w:hAnsi="Arial" w:cs="Arial" w:eastAsia="Arial"/>
+          <w:rtl w:val="1"/>
+        </w:rPr>
         <w:t>مثال نمذجة بصوت مسموع</w:t>
       </w:r>
     </w:p>
@@ -4375,6 +6503,346 @@
           <w:rFonts w:ascii="Arial" w:hAnsi="Arial" w:cs="Arial" w:eastAsia="Arial"/>
           <w:rtl w:val="1"/>
         </w:rPr>
+        <w:t>مولدات فكرة بحسب نقطة الانطلاق</w:t>
+      </w:r>
+    </w:p>
+    <w:p>
+      <w:pPr>
+        <w:jc w:val="right"/>
+        <w:widowControl/>
+        <w:bidi w:val="1"/>
+      </w:pPr>
+      <w:r>
+        <w:rPr>
+          <w:rFonts w:ascii="Arial" w:hAnsi="Arial" w:cs="Arial" w:eastAsia="Arial"/>
+          <w:rtl w:val="1"/>
+        </w:rPr>
+        <w:t>يمكن للميسّر تدوير نقطة البداية إذا لم تنجح الصورة أو السؤال الأول:</w:t>
+      </w:r>
+    </w:p>
+    <w:p>
+      <w:pPr>
+        <w:spacing w:after="60"/>
+        <w:ind w:right="198" w:hanging="142"/>
+        <w:jc w:val="right"/>
+        <w:bidi w:val="1"/>
+      </w:pPr>
+      <w:r>
+        <w:rPr>
+          <w:rFonts w:ascii="Arial" w:hAnsi="Arial" w:cs="Arial" w:eastAsia="Arial"/>
+          <w:rtl w:val="1"/>
+        </w:rPr>
+        <w:t xml:space="preserve">• </w:t>
+      </w:r>
+      <w:r>
+        <w:rPr>
+          <w:rFonts w:ascii="Arial" w:hAnsi="Arial" w:cs="Arial" w:eastAsia="Arial"/>
+          <w:b/>
+          <w:rtl w:val="1"/>
+        </w:rPr>
+        <w:t>غرض:</w:t>
+      </w:r>
+      <w:r>
+        <w:rPr>
+          <w:rFonts w:ascii="Arial" w:hAnsi="Arial" w:cs="Arial" w:eastAsia="Arial"/>
+          <w:rtl w:val="1"/>
+        </w:rPr>
+        <w:t xml:space="preserve"> من يملك هذا المفتاح؟ وما الباب الذي لا يستطيع فتحه؟</w:t>
+      </w:r>
+    </w:p>
+    <w:p>
+      <w:pPr>
+        <w:spacing w:after="60"/>
+        <w:ind w:right="198" w:hanging="142"/>
+        <w:jc w:val="right"/>
+        <w:bidi w:val="1"/>
+      </w:pPr>
+      <w:r>
+        <w:rPr>
+          <w:rFonts w:ascii="Arial" w:hAnsi="Arial" w:cs="Arial" w:eastAsia="Arial"/>
+          <w:rtl w:val="1"/>
+        </w:rPr>
+        <w:t xml:space="preserve">• </w:t>
+      </w:r>
+      <w:r>
+        <w:rPr>
+          <w:rFonts w:ascii="Arial" w:hAnsi="Arial" w:cs="Arial" w:eastAsia="Arial"/>
+          <w:b/>
+          <w:rtl w:val="1"/>
+        </w:rPr>
+        <w:t>مكان:</w:t>
+      </w:r>
+      <w:r>
+        <w:rPr>
+          <w:rFonts w:ascii="Arial" w:hAnsi="Arial" w:cs="Arial" w:eastAsia="Arial"/>
+          <w:rtl w:val="1"/>
+        </w:rPr>
+        <w:t xml:space="preserve"> ما الشيء غير المتوقع الذي قد يحدث في مكتبة هادئة؟</w:t>
+      </w:r>
+    </w:p>
+    <w:p>
+      <w:pPr>
+        <w:spacing w:after="60"/>
+        <w:ind w:right="198" w:hanging="142"/>
+        <w:jc w:val="right"/>
+        <w:bidi w:val="1"/>
+      </w:pPr>
+      <w:r>
+        <w:rPr>
+          <w:rFonts w:ascii="Arial" w:hAnsi="Arial" w:cs="Arial" w:eastAsia="Arial"/>
+          <w:rtl w:val="1"/>
+        </w:rPr>
+        <w:t xml:space="preserve">• </w:t>
+      </w:r>
+      <w:r>
+        <w:rPr>
+          <w:rFonts w:ascii="Arial" w:hAnsi="Arial" w:cs="Arial" w:eastAsia="Arial"/>
+          <w:b/>
+          <w:rtl w:val="1"/>
+        </w:rPr>
+        <w:t>شعور:</w:t>
+      </w:r>
+      <w:r>
+        <w:rPr>
+          <w:rFonts w:ascii="Arial" w:hAnsi="Arial" w:cs="Arial" w:eastAsia="Arial"/>
+          <w:rtl w:val="1"/>
+        </w:rPr>
+        <w:t xml:space="preserve"> متى يشعر البطل بالحيرة؟ وما الاختيار الذي يساعده؟</w:t>
+      </w:r>
+    </w:p>
+    <w:p>
+      <w:pPr>
+        <w:spacing w:after="60"/>
+        <w:ind w:right="198" w:hanging="142"/>
+        <w:jc w:val="right"/>
+        <w:bidi w:val="1"/>
+      </w:pPr>
+      <w:r>
+        <w:rPr>
+          <w:rFonts w:ascii="Arial" w:hAnsi="Arial" w:cs="Arial" w:eastAsia="Arial"/>
+          <w:rtl w:val="1"/>
+        </w:rPr>
+        <w:t xml:space="preserve">• </w:t>
+      </w:r>
+      <w:r>
+        <w:rPr>
+          <w:rFonts w:ascii="Arial" w:hAnsi="Arial" w:cs="Arial" w:eastAsia="Arial"/>
+          <w:b/>
+          <w:rtl w:val="1"/>
+        </w:rPr>
+        <w:t>صوت:</w:t>
+      </w:r>
+      <w:r>
+        <w:rPr>
+          <w:rFonts w:ascii="Arial" w:hAnsi="Arial" w:cs="Arial" w:eastAsia="Arial"/>
+          <w:rtl w:val="1"/>
+        </w:rPr>
+        <w:t xml:space="preserve"> سمع الطفل نقرة من صندوق؛ من أين تأتي، ولماذا لا يسمعها الآخرون؟</w:t>
+      </w:r>
+    </w:p>
+    <w:p>
+      <w:pPr>
+        <w:spacing w:after="60"/>
+        <w:ind w:right="198" w:hanging="142"/>
+        <w:jc w:val="right"/>
+        <w:bidi w:val="1"/>
+      </w:pPr>
+      <w:r>
+        <w:rPr>
+          <w:rFonts w:ascii="Arial" w:hAnsi="Arial" w:cs="Arial" w:eastAsia="Arial"/>
+          <w:rtl w:val="1"/>
+        </w:rPr>
+        <w:t xml:space="preserve">• </w:t>
+      </w:r>
+      <w:r>
+        <w:rPr>
+          <w:rFonts w:ascii="Arial" w:hAnsi="Arial" w:cs="Arial" w:eastAsia="Arial"/>
+          <w:b/>
+          <w:rtl w:val="1"/>
+        </w:rPr>
+        <w:t>سؤال «ماذا لو؟»:</w:t>
+      </w:r>
+      <w:r>
+        <w:rPr>
+          <w:rFonts w:ascii="Arial" w:hAnsi="Arial" w:cs="Arial" w:eastAsia="Arial"/>
+          <w:rtl w:val="1"/>
+        </w:rPr>
+        <w:t xml:space="preserve"> ماذا لو أمكن للرسائل أن تعود إلى أصحابها؟</w:t>
+      </w:r>
+    </w:p>
+    <w:p>
+      <w:pPr>
+        <w:jc w:val="right"/>
+        <w:widowControl/>
+        <w:bidi w:val="1"/>
+      </w:pPr>
+      <w:r>
+        <w:rPr>
+          <w:rFonts w:ascii="Arial" w:hAnsi="Arial" w:cs="Arial" w:eastAsia="Arial"/>
+          <w:rtl w:val="1"/>
+        </w:rPr>
+        <w:t>ثم نختبر البذرة بجملة واحدة. إذا قال الطفل «قصة عن المكتبة»، اسأله: «من في المكتبة؟ ماذا يريد؟ ما الشيء الذي يعطله؟». وإذا قال «قصة عن الخوف»، ساعده على اختيار موقف متخيل يُظهر الشعور من غير إلزامه بحكاية شخصية.</w:t>
+      </w:r>
+    </w:p>
+    <w:p>
+      <w:pPr>
+        <w:pStyle w:val="Heading2"/>
+        <w:jc w:val="right"/>
+        <w:bidi w:val="1"/>
+      </w:pPr>
+      <w:r>
+        <w:rPr>
+          <w:rFonts w:ascii="Arial" w:hAnsi="Arial" w:cs="Arial" w:eastAsia="Arial"/>
+          <w:rtl w:val="1"/>
+        </w:rPr>
+        <w:t>أربعة أمثلة على بذور من أجواء مختلفة</w:t>
+      </w:r>
+    </w:p>
+    <w:p>
+      <w:pPr>
+        <w:spacing w:after="60"/>
+        <w:ind w:right="198" w:hanging="142"/>
+        <w:jc w:val="right"/>
+        <w:bidi w:val="1"/>
+      </w:pPr>
+      <w:r>
+        <w:rPr>
+          <w:rFonts w:ascii="Arial" w:hAnsi="Arial" w:cs="Arial" w:eastAsia="Arial"/>
+          <w:rtl w:val="1"/>
+        </w:rPr>
+        <w:t xml:space="preserve">• </w:t>
+      </w:r>
+      <w:r>
+        <w:rPr>
+          <w:rFonts w:ascii="Arial" w:hAnsi="Arial" w:cs="Arial" w:eastAsia="Arial"/>
+          <w:b/>
+          <w:rtl w:val="1"/>
+        </w:rPr>
+        <w:t>واقعية:</w:t>
+      </w:r>
+      <w:r>
+        <w:rPr>
+          <w:rFonts w:ascii="Arial" w:hAnsi="Arial" w:cs="Arial" w:eastAsia="Arial"/>
+          <w:rtl w:val="1"/>
+        </w:rPr>
+        <w:t xml:space="preserve"> تريد هدى إعادة كتاب استعارتْه، لكنها لا تجد بطاقة المكتبة.</w:t>
+      </w:r>
+    </w:p>
+    <w:p>
+      <w:pPr>
+        <w:spacing w:after="60"/>
+        <w:ind w:right="198" w:hanging="142"/>
+        <w:jc w:val="right"/>
+        <w:bidi w:val="1"/>
+      </w:pPr>
+      <w:r>
+        <w:rPr>
+          <w:rFonts w:ascii="Arial" w:hAnsi="Arial" w:cs="Arial" w:eastAsia="Arial"/>
+          <w:rtl w:val="1"/>
+        </w:rPr>
+        <w:t xml:space="preserve">• </w:t>
+      </w:r>
+      <w:r>
+        <w:rPr>
+          <w:rFonts w:ascii="Arial" w:hAnsi="Arial" w:cs="Arial" w:eastAsia="Arial"/>
+          <w:b/>
+          <w:rtl w:val="1"/>
+        </w:rPr>
+        <w:t>غموض:</w:t>
+      </w:r>
+      <w:r>
+        <w:rPr>
+          <w:rFonts w:ascii="Arial" w:hAnsi="Arial" w:cs="Arial" w:eastAsia="Arial"/>
+          <w:rtl w:val="1"/>
+        </w:rPr>
+        <w:t xml:space="preserve"> يسمع الحارس رنينًا في رف الكتب بعد الإغلاق، ويبحث عن مصدره.</w:t>
+      </w:r>
+    </w:p>
+    <w:p>
+      <w:pPr>
+        <w:spacing w:after="60"/>
+        <w:ind w:right="198" w:hanging="142"/>
+        <w:jc w:val="right"/>
+        <w:bidi w:val="1"/>
+      </w:pPr>
+      <w:r>
+        <w:rPr>
+          <w:rFonts w:ascii="Arial" w:hAnsi="Arial" w:cs="Arial" w:eastAsia="Arial"/>
+          <w:rtl w:val="1"/>
+        </w:rPr>
+        <w:t xml:space="preserve">• </w:t>
+      </w:r>
+      <w:r>
+        <w:rPr>
+          <w:rFonts w:ascii="Arial" w:hAnsi="Arial" w:cs="Arial" w:eastAsia="Arial"/>
+          <w:b/>
+          <w:rtl w:val="1"/>
+        </w:rPr>
+        <w:t>فانتازيا:</w:t>
+      </w:r>
+      <w:r>
+        <w:rPr>
+          <w:rFonts w:ascii="Arial" w:hAnsi="Arial" w:cs="Arial" w:eastAsia="Arial"/>
+          <w:rtl w:val="1"/>
+        </w:rPr>
+        <w:t xml:space="preserve"> يجد سامر قلمًا يكتب الكلمة التي سيسمعها بعد دقيقة، لكنه لا يستطيع إيقافه.</w:t>
+      </w:r>
+    </w:p>
+    <w:p>
+      <w:pPr>
+        <w:spacing w:after="60"/>
+        <w:ind w:right="198" w:hanging="142"/>
+        <w:jc w:val="right"/>
+        <w:bidi w:val="1"/>
+      </w:pPr>
+      <w:r>
+        <w:rPr>
+          <w:rFonts w:ascii="Arial" w:hAnsi="Arial" w:cs="Arial" w:eastAsia="Arial"/>
+          <w:rtl w:val="1"/>
+        </w:rPr>
+        <w:t xml:space="preserve">• </w:t>
+      </w:r>
+      <w:r>
+        <w:rPr>
+          <w:rFonts w:ascii="Arial" w:hAnsi="Arial" w:cs="Arial" w:eastAsia="Arial"/>
+          <w:b/>
+          <w:rtl w:val="1"/>
+        </w:rPr>
+        <w:t>فكاهة:</w:t>
+      </w:r>
+      <w:r>
+        <w:rPr>
+          <w:rFonts w:ascii="Arial" w:hAnsi="Arial" w:cs="Arial" w:eastAsia="Arial"/>
+          <w:rtl w:val="1"/>
+        </w:rPr>
+        <w:t xml:space="preserve"> يحاول روبوت صغير أن يتعلم ترتيب الحذاء، فيضع كل زوج في مكان مختلف.</w:t>
+      </w:r>
+    </w:p>
+    <w:p>
+      <w:pPr>
+        <w:jc w:val="right"/>
+        <w:widowControl/>
+        <w:bidi w:val="1"/>
+      </w:pPr>
+      <w:r>
+        <w:rPr>
+          <w:rFonts w:ascii="Arial" w:hAnsi="Arial" w:cs="Arial" w:eastAsia="Arial"/>
+          <w:rtl w:val="1"/>
+        </w:rPr>
+        <w:t>تُستخدم الأمثلة لإظهار إمكانات الأنواع لا لفرضها. يختار الطفل الجو الذي يرغب فيه، ويستطيع المزج بينها إذا بقيت قواعد العالم مفهومة.</w:t>
+      </w:r>
+    </w:p>
+    <w:p>
+      <w:pPr>
+        <w:pStyle w:val="Heading2"/>
+        <w:jc w:val="right"/>
+        <w:bidi w:val="1"/>
+      </w:pPr>
+      <w:r>
+        <w:rPr>
+          <w:rFonts w:ascii="Arial" w:hAnsi="Arial" w:cs="Arial" w:eastAsia="Arial"/>
+          <w:rtl w:val="1"/>
+        </w:rPr>
         <w:t>درس مصغر: من غرض إلى بذرة</w:t>
       </w:r>
     </w:p>
@@ -5277,6 +7745,166 @@
           <w:rFonts w:ascii="Arial" w:hAnsi="Arial" w:cs="Arial" w:eastAsia="Arial"/>
           <w:rtl w:val="1"/>
         </w:rPr>
+        <w:t>الصراع الخارجي والتحدي الداخلي</w:t>
+      </w:r>
+    </w:p>
+    <w:p>
+      <w:pPr>
+        <w:jc w:val="right"/>
+        <w:widowControl/>
+        <w:bidi w:val="1"/>
+      </w:pPr>
+      <w:r>
+        <w:rPr>
+          <w:rFonts w:ascii="Arial" w:hAnsi="Arial" w:cs="Arial" w:eastAsia="Arial"/>
+          <w:rtl w:val="1"/>
+        </w:rPr>
+        <w:t>قد تكون العقبة خارج الشخصية، مثل باب مغلق أو وقت محدود، وقد تكون داخلها، مثل خوف من السؤال أو تردد في الاعتراف بخطأ. في القصص القصيرة الأولى يكفي تحدٍّ واحد؛ ويمكن إضافة تحدٍّ داخلي إذا كان مرتبطًا بما يحدث في الخارج.</w:t>
+      </w:r>
+    </w:p>
+    <w:p>
+      <w:pPr>
+        <w:jc w:val="right"/>
+        <w:widowControl/>
+        <w:bidi w:val="1"/>
+      </w:pPr>
+      <w:r>
+        <w:rPr>
+          <w:rFonts w:ascii="Arial" w:hAnsi="Arial" w:cs="Arial" w:eastAsia="Arial"/>
+          <w:rtl w:val="1"/>
+        </w:rPr>
+        <w:t>مثال: يريد البطل العثور على قطته، لكن باب المخزن مغلق. هذه عقبة خارجية. يشعر بالقلق ويتردد في طلب المساعدة؛ وهذا تحدٍّ داخلي. حين يختار أن يشرح ما حدث للحارس، يتحرك الحدث وتظهر صفة المسؤولية من خلال فعل، لا من خلال وصف مباشر.</w:t>
+      </w:r>
+    </w:p>
+    <w:p>
+      <w:pPr>
+        <w:jc w:val="right"/>
+        <w:widowControl/>
+        <w:bidi w:val="1"/>
+      </w:pPr>
+      <w:r>
+        <w:rPr>
+          <w:rFonts w:ascii="Arial" w:hAnsi="Arial" w:cs="Arial" w:eastAsia="Arial"/>
+          <w:rtl w:val="1"/>
+        </w:rPr>
+        <w:t>استخدم مخططًا من ثلاثة أسطر:</w:t>
+      </w:r>
+    </w:p>
+    <w:p>
+      <w:pPr>
+        <w:spacing w:after="60"/>
+        <w:ind w:right="198" w:hanging="142"/>
+        <w:jc w:val="right"/>
+        <w:bidi w:val="1"/>
+      </w:pPr>
+      <w:r>
+        <w:rPr>
+          <w:rFonts w:ascii="Arial" w:hAnsi="Arial" w:cs="Arial" w:eastAsia="Arial"/>
+          <w:rtl w:val="1"/>
+        </w:rPr>
+        <w:t xml:space="preserve">• </w:t>
+      </w:r>
+      <w:r>
+        <w:rPr>
+          <w:rFonts w:ascii="Arial" w:hAnsi="Arial" w:cs="Arial" w:eastAsia="Arial"/>
+          <w:b/>
+          <w:rtl w:val="1"/>
+        </w:rPr>
+        <w:t>ما الذي يمنع الهدف؟</w:t>
+      </w:r>
+      <w:r>
+        <w:rPr>
+          <w:rFonts w:ascii="Arial" w:hAnsi="Arial" w:cs="Arial" w:eastAsia="Arial"/>
+          <w:rtl w:val="1"/>
+        </w:rPr>
+        <w:t xml:space="preserve"> __________</w:t>
+      </w:r>
+    </w:p>
+    <w:p>
+      <w:pPr>
+        <w:spacing w:after="60"/>
+        <w:ind w:right="198" w:hanging="142"/>
+        <w:jc w:val="right"/>
+        <w:bidi w:val="1"/>
+      </w:pPr>
+      <w:r>
+        <w:rPr>
+          <w:rFonts w:ascii="Arial" w:hAnsi="Arial" w:cs="Arial" w:eastAsia="Arial"/>
+          <w:rtl w:val="1"/>
+        </w:rPr>
+        <w:t xml:space="preserve">• </w:t>
+      </w:r>
+      <w:r>
+        <w:rPr>
+          <w:rFonts w:ascii="Arial" w:hAnsi="Arial" w:cs="Arial" w:eastAsia="Arial"/>
+          <w:b/>
+          <w:rtl w:val="1"/>
+        </w:rPr>
+        <w:t>كيف يشعر البطل أو يفكر؟</w:t>
+      </w:r>
+      <w:r>
+        <w:rPr>
+          <w:rFonts w:ascii="Arial" w:hAnsi="Arial" w:cs="Arial" w:eastAsia="Arial"/>
+          <w:rtl w:val="1"/>
+        </w:rPr>
+        <w:t xml:space="preserve"> __________</w:t>
+      </w:r>
+    </w:p>
+    <w:p>
+      <w:pPr>
+        <w:spacing w:after="60"/>
+        <w:ind w:right="198" w:hanging="142"/>
+        <w:jc w:val="right"/>
+        <w:bidi w:val="1"/>
+      </w:pPr>
+      <w:r>
+        <w:rPr>
+          <w:rFonts w:ascii="Arial" w:hAnsi="Arial" w:cs="Arial" w:eastAsia="Arial"/>
+          <w:rtl w:val="1"/>
+        </w:rPr>
+        <w:t xml:space="preserve">• </w:t>
+      </w:r>
+      <w:r>
+        <w:rPr>
+          <w:rFonts w:ascii="Arial" w:hAnsi="Arial" w:cs="Arial" w:eastAsia="Arial"/>
+          <w:b/>
+          <w:rtl w:val="1"/>
+        </w:rPr>
+        <w:t>ما القرار الذي يربط الشعور بالفعل؟</w:t>
+      </w:r>
+      <w:r>
+        <w:rPr>
+          <w:rFonts w:ascii="Arial" w:hAnsi="Arial" w:cs="Arial" w:eastAsia="Arial"/>
+          <w:rtl w:val="1"/>
+        </w:rPr>
+        <w:t xml:space="preserve"> __________</w:t>
+      </w:r>
+    </w:p>
+    <w:p>
+      <w:pPr>
+        <w:jc w:val="right"/>
+        <w:widowControl/>
+        <w:bidi w:val="1"/>
+      </w:pPr>
+      <w:r>
+        <w:rPr>
+          <w:rFonts w:ascii="Arial" w:hAnsi="Arial" w:cs="Arial" w:eastAsia="Arial"/>
+          <w:rtl w:val="1"/>
+        </w:rPr>
+        <w:t>لا يلزم أن ينتهي كل صراع بتغير كبير في الشخصية. أحيانًا يتعلم البطل معلومة، أو يطلب المساعدة، أو يختار طريقة أخرى. المهم أن يكون الحل متصلًا بالمشكلة، وأن يبقى مناسبًا لعمر الطفل وخبرته.</w:t>
+      </w:r>
+    </w:p>
+    <w:p>
+      <w:pPr>
+        <w:pStyle w:val="Heading2"/>
+        <w:jc w:val="right"/>
+        <w:bidi w:val="1"/>
+      </w:pPr>
+      <w:r>
+        <w:rPr>
+          <w:rFonts w:ascii="Arial" w:hAnsi="Arial" w:cs="Arial" w:eastAsia="Arial"/>
+          <w:rtl w:val="1"/>
+        </w:rPr>
         <w:t>مراعاة العدالة والاحترام</w:t>
       </w:r>
     </w:p>
@@ -5637,6 +8265,166 @@
           <w:rFonts w:ascii="Arial" w:hAnsi="Arial" w:cs="Arial" w:eastAsia="Arial"/>
           <w:rtl w:val="1"/>
         </w:rPr>
+        <w:t>سلم الوصف: من العام إلى التفصيل</w:t>
+      </w:r>
+    </w:p>
+    <w:p>
+      <w:pPr>
+        <w:jc w:val="right"/>
+        <w:widowControl/>
+        <w:bidi w:val="1"/>
+      </w:pPr>
+      <w:r>
+        <w:rPr>
+          <w:rFonts w:ascii="Arial" w:hAnsi="Arial" w:cs="Arial" w:eastAsia="Arial"/>
+          <w:rtl w:val="1"/>
+        </w:rPr>
+        <w:t>يمكن تعليم الوصف كحركة من صورة واسعة إلى تفصيل قريب، لا كقائمة حواس واجبة:</w:t>
+      </w:r>
+    </w:p>
+    <w:p>
+      <w:pPr>
+        <w:spacing w:after="60"/>
+        <w:ind w:right="198" w:hanging="142"/>
+        <w:jc w:val="right"/>
+        <w:bidi w:val="1"/>
+      </w:pPr>
+      <w:r>
+        <w:rPr>
+          <w:rFonts w:ascii="Arial" w:hAnsi="Arial" w:cs="Arial" w:eastAsia="Arial"/>
+          <w:rtl w:val="1"/>
+        </w:rPr>
+        <w:t xml:space="preserve">1. </w:t>
+      </w:r>
+      <w:r>
+        <w:rPr>
+          <w:rFonts w:ascii="Arial" w:hAnsi="Arial" w:cs="Arial" w:eastAsia="Arial"/>
+          <w:b/>
+          <w:rtl w:val="1"/>
+        </w:rPr>
+        <w:t>الصورة العامة:</w:t>
+      </w:r>
+      <w:r>
+        <w:rPr>
+          <w:rFonts w:ascii="Arial" w:hAnsi="Arial" w:cs="Arial" w:eastAsia="Arial"/>
+          <w:rtl w:val="1"/>
+        </w:rPr>
+        <w:t xml:space="preserve"> أين نحن؟ «في حديقة الحي».</w:t>
+      </w:r>
+    </w:p>
+    <w:p>
+      <w:pPr>
+        <w:spacing w:after="60"/>
+        <w:ind w:right="198" w:hanging="142"/>
+        <w:jc w:val="right"/>
+        <w:bidi w:val="1"/>
+      </w:pPr>
+      <w:r>
+        <w:rPr>
+          <w:rFonts w:ascii="Arial" w:hAnsi="Arial" w:cs="Arial" w:eastAsia="Arial"/>
+          <w:rtl w:val="1"/>
+        </w:rPr>
+        <w:t xml:space="preserve">2. </w:t>
+      </w:r>
+      <w:r>
+        <w:rPr>
+          <w:rFonts w:ascii="Arial" w:hAnsi="Arial" w:cs="Arial" w:eastAsia="Arial"/>
+          <w:b/>
+          <w:rtl w:val="1"/>
+        </w:rPr>
+        <w:t>تفصيل يلفت الانتباه:</w:t>
+      </w:r>
+      <w:r>
+        <w:rPr>
+          <w:rFonts w:ascii="Arial" w:hAnsi="Arial" w:cs="Arial" w:eastAsia="Arial"/>
+          <w:rtl w:val="1"/>
+        </w:rPr>
+        <w:t xml:space="preserve"> ما الشيء الذي يراه البطل؟ «جرس أزرق قرب الباب».</w:t>
+      </w:r>
+    </w:p>
+    <w:p>
+      <w:pPr>
+        <w:spacing w:after="60"/>
+        <w:ind w:right="198" w:hanging="142"/>
+        <w:jc w:val="right"/>
+        <w:bidi w:val="1"/>
+      </w:pPr>
+      <w:r>
+        <w:rPr>
+          <w:rFonts w:ascii="Arial" w:hAnsi="Arial" w:cs="Arial" w:eastAsia="Arial"/>
+          <w:rtl w:val="1"/>
+        </w:rPr>
+        <w:t xml:space="preserve">3. </w:t>
+      </w:r>
+      <w:r>
+        <w:rPr>
+          <w:rFonts w:ascii="Arial" w:hAnsi="Arial" w:cs="Arial" w:eastAsia="Arial"/>
+          <w:b/>
+          <w:rtl w:val="1"/>
+        </w:rPr>
+        <w:t>تفصيل يؤثر في الفعل:</w:t>
+      </w:r>
+      <w:r>
+        <w:rPr>
+          <w:rFonts w:ascii="Arial" w:hAnsi="Arial" w:cs="Arial" w:eastAsia="Arial"/>
+          <w:rtl w:val="1"/>
+        </w:rPr>
+        <w:t xml:space="preserve"> ماذا يفعل البطل بسبب ما لاحظه؟ «اقترب آدم، لكنه توقف عندما سمع صوتًا من الداخل».</w:t>
+      </w:r>
+    </w:p>
+    <w:p>
+      <w:pPr>
+        <w:jc w:val="right"/>
+        <w:widowControl/>
+        <w:bidi w:val="1"/>
+      </w:pPr>
+      <w:r>
+        <w:rPr>
+          <w:rFonts w:ascii="Arial" w:hAnsi="Arial" w:cs="Arial" w:eastAsia="Arial"/>
+          <w:rtl w:val="1"/>
+        </w:rPr>
+        <w:t>تُظهر هذه الخطوات أن الوصف قد يخدم المكان، وقد يحمل دليلًا، وقد يغير القرار. إذا كتب الطفل خمسة ألوان وأسماء أشياء، اسأله أي تفصيل يساعد القارئ على فهم ما سيحدث. وإذا كان النص جافًا جدًا، اطلب منه اختيار تفصيل واحد من السمع أو الرؤية أو الحركة، لا أن يضيف الحواس كلها.</w:t>
+      </w:r>
+    </w:p>
+    <w:p>
+      <w:pPr>
+        <w:pStyle w:val="Heading2"/>
+        <w:jc w:val="right"/>
+        <w:bidi w:val="1"/>
+      </w:pPr>
+      <w:r>
+        <w:rPr>
+          <w:rFonts w:ascii="Arial" w:hAnsi="Arial" w:cs="Arial" w:eastAsia="Arial"/>
+          <w:rtl w:val="1"/>
+        </w:rPr>
+        <w:t>تمرين «احذف لتوضح»</w:t>
+      </w:r>
+    </w:p>
+    <w:p>
+      <w:pPr>
+        <w:jc w:val="right"/>
+        <w:widowControl/>
+        <w:bidi w:val="1"/>
+      </w:pPr>
+      <w:r>
+        <w:rPr>
+          <w:rFonts w:ascii="Arial" w:hAnsi="Arial" w:cs="Arial" w:eastAsia="Arial"/>
+          <w:rtl w:val="1"/>
+        </w:rPr>
+        <w:t>يختار الطفل فقرة وصفية، ويضع دائرة حول التفصيل الذي يفضله، ثم يحذف تفصيلًا لا يضيف معنى. يقرأ النسختين ويسأل: هل أصبح المشهد أسرع؟ هل فقدت القصة شيئًا مهمًا؟ الحذف هنا قرار مؤقت؛ يستطيع الكاتب إعادة التفصيل إذا احتاج إليه لاحقًا.</w:t>
+      </w:r>
+    </w:p>
+    <w:p>
+      <w:pPr>
+        <w:pStyle w:val="Heading2"/>
+        <w:jc w:val="right"/>
+        <w:bidi w:val="1"/>
+      </w:pPr>
+      <w:r>
+        <w:rPr>
+          <w:rFonts w:ascii="Arial" w:hAnsi="Arial" w:cs="Arial" w:eastAsia="Arial"/>
+          <w:rtl w:val="1"/>
+        </w:rPr>
         <w:t>من الملاحظة إلى الجملة</w:t>
       </w:r>
     </w:p>
@@ -6559,6 +9347,137 @@
           <w:rFonts w:ascii="Arial" w:hAnsi="Arial" w:cs="Arial" w:eastAsia="Arial"/>
           <w:rtl w:val="1"/>
         </w:rPr>
+        <w:t>تصميم عقبة لها وظيفة</w:t>
+      </w:r>
+    </w:p>
+    <w:p>
+      <w:pPr>
+        <w:jc w:val="right"/>
+        <w:widowControl/>
+        <w:bidi w:val="1"/>
+      </w:pPr>
+      <w:r>
+        <w:rPr>
+          <w:rFonts w:ascii="Arial" w:hAnsi="Arial" w:cs="Arial" w:eastAsia="Arial"/>
+          <w:rtl w:val="1"/>
+        </w:rPr>
+        <w:t>العقبة المفيدة لا تضاف لمجرد إطالة القصة؛ بل تجعل البطل يجرّب أو يختار أو يتعلم معلومة. قبل اعتماد العقبة، اختبرها بهذه الأسئلة:</w:t>
+      </w:r>
+    </w:p>
+    <w:p>
+      <w:pPr>
+        <w:spacing w:after="60"/>
+        <w:ind w:right="198" w:hanging="142"/>
+        <w:jc w:val="right"/>
+        <w:bidi w:val="1"/>
+      </w:pPr>
+      <w:r>
+        <w:rPr>
+          <w:rFonts w:ascii="Arial" w:hAnsi="Arial" w:cs="Arial" w:eastAsia="Arial"/>
+          <w:rtl w:val="1"/>
+        </w:rPr>
+        <w:t>• هل تمنع الهدف أو تؤخره فعلًا؟</w:t>
+      </w:r>
+    </w:p>
+    <w:p>
+      <w:pPr>
+        <w:spacing w:after="60"/>
+        <w:ind w:right="198" w:hanging="142"/>
+        <w:jc w:val="right"/>
+        <w:bidi w:val="1"/>
+      </w:pPr>
+      <w:r>
+        <w:rPr>
+          <w:rFonts w:ascii="Arial" w:hAnsi="Arial" w:cs="Arial" w:eastAsia="Arial"/>
+          <w:rtl w:val="1"/>
+        </w:rPr>
+        <w:t>• هل يستطيع البطل القيام بمحاولة مناسبة لمستواه؟</w:t>
+      </w:r>
+    </w:p>
+    <w:p>
+      <w:pPr>
+        <w:spacing w:after="60"/>
+        <w:ind w:right="198" w:hanging="142"/>
+        <w:jc w:val="right"/>
+        <w:bidi w:val="1"/>
+      </w:pPr>
+      <w:r>
+        <w:rPr>
+          <w:rFonts w:ascii="Arial" w:hAnsi="Arial" w:cs="Arial" w:eastAsia="Arial"/>
+          <w:rtl w:val="1"/>
+        </w:rPr>
+        <w:t>• ماذا تكشف نتيجة المحاولة؟</w:t>
+      </w:r>
+    </w:p>
+    <w:p>
+      <w:pPr>
+        <w:spacing w:after="60"/>
+        <w:ind w:right="198" w:hanging="142"/>
+        <w:jc w:val="right"/>
+        <w:bidi w:val="1"/>
+      </w:pPr>
+      <w:r>
+        <w:rPr>
+          <w:rFonts w:ascii="Arial" w:hAnsi="Arial" w:cs="Arial" w:eastAsia="Arial"/>
+          <w:rtl w:val="1"/>
+        </w:rPr>
+        <w:t>• هل تغيّر العقبة خطة البطل أو معلومات القارئ؟</w:t>
+      </w:r>
+    </w:p>
+    <w:p>
+      <w:pPr>
+        <w:spacing w:after="60"/>
+        <w:ind w:right="198" w:hanging="142"/>
+        <w:jc w:val="right"/>
+        <w:bidi w:val="1"/>
+      </w:pPr>
+      <w:r>
+        <w:rPr>
+          <w:rFonts w:ascii="Arial" w:hAnsi="Arial" w:cs="Arial" w:eastAsia="Arial"/>
+          <w:rtl w:val="1"/>
+        </w:rPr>
+        <w:t>• هل يستطيع الطفل حلها بطريقة آمنة ومقنعة؟</w:t>
+      </w:r>
+    </w:p>
+    <w:p>
+      <w:pPr>
+        <w:jc w:val="right"/>
+        <w:widowControl/>
+        <w:bidi w:val="1"/>
+      </w:pPr>
+      <w:r>
+        <w:rPr>
+          <w:rFonts w:ascii="Arial" w:hAnsi="Arial" w:cs="Arial" w:eastAsia="Arial"/>
+          <w:rtl w:val="1"/>
+        </w:rPr>
+        <w:t>يمكن ترتيب المحاولات على سلم بسيط: محاولة أولى متوقعة، ثم دليل جديد، ثم قرار أنسب. لا يلزم أن تصبح المخاطر أكبر في كل مرة؛ يكفي أن يصبح فهم البطل للموقف أعمق. مثلًا، ينادي آدم لولو فلا يسمع جوابًا، ثم يلاحظ الجرس قرب المخزن، ثم يطلب مساعدة الحارس. كل خطوة مختلفة وتفسر التي بعدها.</w:t>
+      </w:r>
+    </w:p>
+    <w:p>
+      <w:pPr>
+        <w:jc w:val="right"/>
+        <w:widowControl/>
+        <w:bidi w:val="1"/>
+      </w:pPr>
+      <w:r>
+        <w:rPr>
+          <w:rFonts w:ascii="Arial" w:hAnsi="Arial" w:cs="Arial" w:eastAsia="Arial"/>
+          <w:rtl w:val="1"/>
+        </w:rPr>
+        <w:t>إذا ظهرت عقبة لا تؤثر في قرار أو نتيجة، فقد تكون مشهدًا جانبيًا. يمكن نقلها إلى قصة أخرى، أو إعطاؤها وظيفة واضحة، أو حذفها. هذا الفحص يساعد الطفل على إبقاء القصة مركزة من غير أن يحد من خياله.</w:t>
+      </w:r>
+    </w:p>
+    <w:p>
+      <w:pPr>
+        <w:pStyle w:val="Heading2"/>
+        <w:jc w:val="right"/>
+        <w:bidi w:val="1"/>
+      </w:pPr>
+      <w:r>
+        <w:rPr>
+          <w:rFonts w:ascii="Arial" w:hAnsi="Arial" w:cs="Arial" w:eastAsia="Arial"/>
+          <w:rtl w:val="1"/>
+        </w:rPr>
         <w:t>اختبار الترابط: «لأن، لكن، لذلك»</w:t>
       </w:r>
     </w:p>
@@ -7412,6 +10331,119 @@
           <w:rFonts w:ascii="Arial" w:hAnsi="Arial" w:cs="Arial" w:eastAsia="Arial"/>
           <w:rtl w:val="1"/>
         </w:rPr>
+        <w:t>بناء مشهد وجملة واضحة</w:t>
+      </w:r>
+    </w:p>
+    <w:p>
+      <w:pPr>
+        <w:jc w:val="right"/>
+        <w:widowControl/>
+        <w:bidi w:val="1"/>
+      </w:pPr>
+      <w:r>
+        <w:rPr>
+          <w:rFonts w:ascii="Arial" w:hAnsi="Arial" w:cs="Arial" w:eastAsia="Arial"/>
+          <w:rtl w:val="1"/>
+        </w:rPr>
+        <w:t xml:space="preserve">يساعد المشهد القصير الطفل على تحويل الخريطة إلى كتابة. اطلب منه أن يحدد ثلاثة أشياء قبل صياغة الجمل: </w:t>
+      </w:r>
+      <w:r>
+        <w:rPr>
+          <w:rFonts w:ascii="Arial" w:hAnsi="Arial" w:cs="Arial" w:eastAsia="Arial"/>
+          <w:b/>
+          <w:rtl w:val="1"/>
+        </w:rPr>
+        <w:t>أين يقف البطل؟ ما الفعل الذي يقع الآن؟ ما الذي يلاحظه أو يقرره؟</w:t>
+      </w:r>
+      <w:r>
+        <w:rPr>
+          <w:rFonts w:ascii="Arial" w:hAnsi="Arial" w:cs="Arial" w:eastAsia="Arial"/>
+          <w:rtl w:val="1"/>
+        </w:rPr>
+        <w:t xml:space="preserve"> ثم يكتب جملتين أو ثلاثًا. ليس مطلوبًا شرح كل شيء في جملة واحدة.</w:t>
+      </w:r>
+    </w:p>
+    <w:p>
+      <w:pPr>
+        <w:jc w:val="right"/>
+        <w:widowControl/>
+        <w:bidi w:val="1"/>
+      </w:pPr>
+      <w:r>
+        <w:rPr>
+          <w:rFonts w:ascii="Arial" w:hAnsi="Arial" w:cs="Arial" w:eastAsia="Arial"/>
+          <w:rtl w:val="1"/>
+        </w:rPr>
+        <w:t>مثال أولي: «آدم عند الباب. سمع صوتًا. طلب الحارس».</w:t>
+      </w:r>
+    </w:p>
+    <w:p>
+      <w:pPr>
+        <w:jc w:val="right"/>
+        <w:widowControl/>
+        <w:bidi w:val="1"/>
+      </w:pPr>
+      <w:r>
+        <w:rPr>
+          <w:rFonts w:ascii="Arial" w:hAnsi="Arial" w:cs="Arial" w:eastAsia="Arial"/>
+          <w:rtl w:val="1"/>
+        </w:rPr>
+        <w:t>أسئلة المراجعة: أي صوت سمع؟ لماذا طلب الحارس؟ ماذا فعل الحارس بعد ذلك؟ قد تصبح الصياغة: «توقف آدم قرب باب المخزن. سمع مواءً خافتًا، لذلك نادى الحارس. طلب منه أن يفتح الباب معه».</w:t>
+      </w:r>
+    </w:p>
+    <w:p>
+      <w:pPr>
+        <w:jc w:val="right"/>
+        <w:widowControl/>
+        <w:bidi w:val="1"/>
+      </w:pPr>
+      <w:r>
+        <w:rPr>
+          <w:rFonts w:ascii="Arial" w:hAnsi="Arial" w:cs="Arial" w:eastAsia="Arial"/>
+          <w:rtl w:val="1"/>
+        </w:rPr>
+        <w:t>يعرض الميسّر أفعالًا دقيقة تساعد الطفل على رؤية الحركة: «اقترب، توقّف، أصغى، لمح، تراجع، أشار، همس». لا يقدمها بوصفها مفردات للحفظ؛ بل يطلب من الطفل اختيار فعل يطابق الصورة التي يتخيلها.</w:t>
+      </w:r>
+    </w:p>
+    <w:p>
+      <w:pPr>
+        <w:pStyle w:val="Heading2"/>
+        <w:jc w:val="right"/>
+        <w:bidi w:val="1"/>
+      </w:pPr>
+      <w:r>
+        <w:rPr>
+          <w:rFonts w:ascii="Arial" w:hAnsi="Arial" w:cs="Arial" w:eastAsia="Arial"/>
+          <w:rtl w:val="1"/>
+        </w:rPr>
+        <w:t>متى نبدأ فقرة جديدة؟</w:t>
+      </w:r>
+    </w:p>
+    <w:p>
+      <w:pPr>
+        <w:jc w:val="right"/>
+        <w:widowControl/>
+        <w:bidi w:val="1"/>
+      </w:pPr>
+      <w:r>
+        <w:rPr>
+          <w:rFonts w:ascii="Arial" w:hAnsi="Arial" w:cs="Arial" w:eastAsia="Arial"/>
+          <w:rtl w:val="1"/>
+        </w:rPr>
+        <w:t>قد يبدأ الطفل فقرة جديدة عندما ينتقل المكان أو الزمن، أو يتغير المتكلم، أو تبدأ لحظة مهمة مختلفة. لا يحتاج في البداية إلى حفظ قاعدة تحريرية طويلة؛ يكفي أن يسأل: «هل حدث تغيير واضح؟ وهل سيساعد القارئ أن أبدأ سطرًا جديدًا؟» يطبق ذلك على فقرة واحدة ثم يراجعها بصوت مسموع.</w:t>
+      </w:r>
+    </w:p>
+    <w:p>
+      <w:pPr>
+        <w:pStyle w:val="Heading2"/>
+        <w:jc w:val="right"/>
+        <w:bidi w:val="1"/>
+      </w:pPr>
+      <w:r>
+        <w:rPr>
+          <w:rFonts w:ascii="Arial" w:hAnsi="Arial" w:cs="Arial" w:eastAsia="Arial"/>
+          <w:rtl w:val="1"/>
+        </w:rPr>
         <w:t>من الكلمة إلى الجملة ثم الفقرة</w:t>
       </w:r>
     </w:p>
@@ -8370,6 +11402,223 @@
           <w:rFonts w:ascii="Arial" w:hAnsi="Arial" w:cs="Arial" w:eastAsia="Arial"/>
           <w:rtl w:val="1"/>
         </w:rPr>
+        <w:t>الحوار وعلاماته وإيقاعه</w:t>
+      </w:r>
+    </w:p>
+    <w:p>
+      <w:pPr>
+        <w:jc w:val="right"/>
+        <w:widowControl/>
+        <w:bidi w:val="1"/>
+      </w:pPr>
+      <w:r>
+        <w:rPr>
+          <w:rFonts w:ascii="Arial" w:hAnsi="Arial" w:cs="Arial" w:eastAsia="Arial"/>
+          <w:rtl w:val="1"/>
+        </w:rPr>
+        <w:t>قبل إضافة علامات الترقيم، ثبّت ثلاثة أمور: من يتكلم؟ إلى من؟ ولماذا؟ بعد ذلك يختار الميسّر نمطًا واحدًا لكتابة الحوار في المجموعة، مثل الشرطة في بداية كلام كل شخصية أو علامتي التنصيص. لا تخلط الأنماط في القصة الواحدة.</w:t>
+      </w:r>
+    </w:p>
+    <w:p>
+      <w:pPr>
+        <w:jc w:val="right"/>
+        <w:widowControl/>
+        <w:bidi w:val="1"/>
+      </w:pPr>
+      <w:r>
+        <w:rPr>
+          <w:rFonts w:ascii="Arial" w:hAnsi="Arial" w:cs="Arial" w:eastAsia="Arial"/>
+          <w:rtl w:val="1"/>
+        </w:rPr>
+        <w:t>تدريب متدرج:</w:t>
+      </w:r>
+    </w:p>
+    <w:p>
+      <w:pPr>
+        <w:spacing w:after="60"/>
+        <w:ind w:right="198" w:hanging="142"/>
+        <w:jc w:val="right"/>
+        <w:bidi w:val="1"/>
+      </w:pPr>
+      <w:r>
+        <w:rPr>
+          <w:rFonts w:ascii="Arial" w:hAnsi="Arial" w:cs="Arial" w:eastAsia="Arial"/>
+          <w:rtl w:val="1"/>
+        </w:rPr>
+        <w:t>1. يمثل طفلان موقفًا قصيرًا.</w:t>
+      </w:r>
+    </w:p>
+    <w:p>
+      <w:pPr>
+        <w:spacing w:after="60"/>
+        <w:ind w:right="198" w:hanging="142"/>
+        <w:jc w:val="right"/>
+        <w:bidi w:val="1"/>
+      </w:pPr>
+      <w:r>
+        <w:rPr>
+          <w:rFonts w:ascii="Arial" w:hAnsi="Arial" w:cs="Arial" w:eastAsia="Arial"/>
+          <w:rtl w:val="1"/>
+        </w:rPr>
+        <w:t>2. يسجل الكاتب الجملة التي غيّرت القرار.</w:t>
+      </w:r>
+    </w:p>
+    <w:p>
+      <w:pPr>
+        <w:spacing w:after="60"/>
+        <w:ind w:right="198" w:hanging="142"/>
+        <w:jc w:val="right"/>
+        <w:bidi w:val="1"/>
+      </w:pPr>
+      <w:r>
+        <w:rPr>
+          <w:rFonts w:ascii="Arial" w:hAnsi="Arial" w:cs="Arial" w:eastAsia="Arial"/>
+          <w:rtl w:val="1"/>
+        </w:rPr>
+        <w:t>3. يكتب كل متكلم في سطر واضح.</w:t>
+      </w:r>
+    </w:p>
+    <w:p>
+      <w:pPr>
+        <w:spacing w:after="60"/>
+        <w:ind w:right="198" w:hanging="142"/>
+        <w:jc w:val="right"/>
+        <w:bidi w:val="1"/>
+      </w:pPr>
+      <w:r>
+        <w:rPr>
+          <w:rFonts w:ascii="Arial" w:hAnsi="Arial" w:cs="Arial" w:eastAsia="Arial"/>
+          <w:rtl w:val="1"/>
+        </w:rPr>
+        <w:t>4. يضيف فعل قول أو حركة عند الحاجة.</w:t>
+      </w:r>
+    </w:p>
+    <w:p>
+      <w:pPr>
+        <w:spacing w:after="60"/>
+        <w:ind w:right="198" w:hanging="142"/>
+        <w:jc w:val="right"/>
+        <w:bidi w:val="1"/>
+      </w:pPr>
+      <w:r>
+        <w:rPr>
+          <w:rFonts w:ascii="Arial" w:hAnsi="Arial" w:cs="Arial" w:eastAsia="Arial"/>
+          <w:rtl w:val="1"/>
+        </w:rPr>
+        <w:t>5. يقرأ الحوار بصوت مسموع ليختبر طبيعته.</w:t>
+      </w:r>
+    </w:p>
+    <w:p>
+      <w:pPr>
+        <w:jc w:val="right"/>
+        <w:widowControl/>
+        <w:bidi w:val="1"/>
+      </w:pPr>
+      <w:r>
+        <w:rPr>
+          <w:rFonts w:ascii="Arial" w:hAnsi="Arial" w:cs="Arial" w:eastAsia="Arial"/>
+          <w:rtl w:val="1"/>
+        </w:rPr>
+        <w:t>إذا كانت الجملة تشرح معلومة يعرفها المتكلمان أصلًا، اسأل: هل يحتاج القارئ إلى سماعها؟ ربما تختصرها في السرد. وإذا استمر الحوار طويلًا، أدرج فعلًا أو رد فعل يكسر الإيقاع ويبين أثر الكلام.</w:t>
+      </w:r>
+    </w:p>
+    <w:p>
+      <w:pPr>
+        <w:jc w:val="right"/>
+        <w:widowControl/>
+        <w:bidi w:val="1"/>
+      </w:pPr>
+      <w:r>
+        <w:rPr>
+          <w:rFonts w:ascii="Arial" w:hAnsi="Arial" w:cs="Arial" w:eastAsia="Arial"/>
+          <w:b/>
+          <w:rtl w:val="1"/>
+        </w:rPr>
+        <w:t>قبل المراجعة:</w:t>
+      </w:r>
+      <w:r>
+        <w:rPr>
+          <w:rFonts w:ascii="Arial" w:hAnsi="Arial" w:cs="Arial" w:eastAsia="Arial"/>
+          <w:rtl w:val="1"/>
+        </w:rPr>
+        <w:t xml:space="preserve"> «قال آدم: هل وجدت لولو؟ قالت لينا: لا لم أجدها. قال آدم: يجب أن نبحث عنها».</w:t>
+      </w:r>
+    </w:p>
+    <w:p>
+      <w:pPr>
+        <w:jc w:val="right"/>
+        <w:widowControl/>
+        <w:bidi w:val="1"/>
+      </w:pPr>
+      <w:r>
+        <w:rPr>
+          <w:rFonts w:ascii="Arial" w:hAnsi="Arial" w:cs="Arial" w:eastAsia="Arial"/>
+          <w:b/>
+          <w:rtl w:val="1"/>
+        </w:rPr>
+        <w:t>بعد المراجعة:</w:t>
+      </w:r>
+      <w:r>
+        <w:rPr>
+          <w:rFonts w:ascii="Arial" w:hAnsi="Arial" w:cs="Arial" w:eastAsia="Arial"/>
+          <w:rtl w:val="1"/>
+        </w:rPr>
+        <w:t xml:space="preserve"> «— هل رأيتِ لولو؟ سأل آدم.</w:t>
+      </w:r>
+    </w:p>
+    <w:p>
+      <w:pPr>
+        <w:jc w:val="right"/>
+        <w:widowControl/>
+        <w:bidi w:val="1"/>
+      </w:pPr>
+      <w:r>
+        <w:rPr>
+          <w:rFonts w:ascii="Arial" w:hAnsi="Arial" w:cs="Arial" w:eastAsia="Arial"/>
+          <w:rtl w:val="1"/>
+        </w:rPr>
+        <w:t>— لا، لكنني سمعت مواءً قرب المخزن، أجابت لينا.</w:t>
+      </w:r>
+    </w:p>
+    <w:p>
+      <w:pPr>
+        <w:jc w:val="right"/>
+        <w:widowControl/>
+        <w:bidi w:val="1"/>
+      </w:pPr>
+      <w:r>
+        <w:rPr>
+          <w:rFonts w:ascii="Arial" w:hAnsi="Arial" w:cs="Arial" w:eastAsia="Arial"/>
+          <w:rtl w:val="1"/>
+        </w:rPr>
+        <w:t>أصغى آدم، ثم نادى الحارس».</w:t>
+      </w:r>
+    </w:p>
+    <w:p>
+      <w:pPr>
+        <w:jc w:val="right"/>
+        <w:widowControl/>
+        <w:bidi w:val="1"/>
+      </w:pPr>
+      <w:r>
+        <w:rPr>
+          <w:rFonts w:ascii="Arial" w:hAnsi="Arial" w:cs="Arial" w:eastAsia="Arial"/>
+          <w:rtl w:val="1"/>
+        </w:rPr>
+        <w:t>لا توجد صيغة وحيدة للحوار؛ الهدف أن يعرف القارئ المتكلم وأن يؤدي الكلام وظيفة.</w:t>
+      </w:r>
+    </w:p>
+    <w:p>
+      <w:pPr>
+        <w:pStyle w:val="Heading2"/>
+        <w:jc w:val="right"/>
+        <w:bidi w:val="1"/>
+      </w:pPr>
+      <w:r>
+        <w:rPr>
+          <w:rFonts w:ascii="Arial" w:hAnsi="Arial" w:cs="Arial" w:eastAsia="Arial"/>
+          <w:rtl w:val="1"/>
+        </w:rPr>
         <w:t>صوت الشخصية من غير تقليد جارح</w:t>
       </w:r>
     </w:p>
@@ -9766,6 +13015,182 @@
           <w:rFonts w:ascii="Arial" w:hAnsi="Arial" w:cs="Arial" w:eastAsia="Arial"/>
           <w:rtl w:val="1"/>
         </w:rPr>
+        <w:t>جولات المراجعة والقراءة الختامية</w:t>
+      </w:r>
+    </w:p>
+    <w:p>
+      <w:pPr>
+        <w:jc w:val="right"/>
+        <w:widowControl/>
+        <w:bidi w:val="1"/>
+      </w:pPr>
+      <w:r>
+        <w:rPr>
+          <w:rFonts w:ascii="Arial" w:hAnsi="Arial" w:cs="Arial" w:eastAsia="Arial"/>
+          <w:rtl w:val="1"/>
+        </w:rPr>
+        <w:t>قسّم المراجعة إلى جولات قصيرة، واجعل لكل جولة سؤالًا واحدًا:</w:t>
+      </w:r>
+    </w:p>
+    <w:p>
+      <w:pPr>
+        <w:spacing w:after="60"/>
+        <w:ind w:right="198" w:hanging="142"/>
+        <w:jc w:val="right"/>
+        <w:bidi w:val="1"/>
+      </w:pPr>
+      <w:r>
+        <w:rPr>
+          <w:rFonts w:ascii="Arial" w:hAnsi="Arial" w:cs="Arial" w:eastAsia="Arial"/>
+          <w:rtl w:val="1"/>
+        </w:rPr>
+        <w:t xml:space="preserve">• </w:t>
+      </w:r>
+      <w:r>
+        <w:rPr>
+          <w:rFonts w:ascii="Arial" w:hAnsi="Arial" w:cs="Arial" w:eastAsia="Arial"/>
+          <w:b/>
+          <w:rtl w:val="1"/>
+        </w:rPr>
+        <w:t>الجولة الأولى — القصة:</w:t>
+      </w:r>
+      <w:r>
+        <w:rPr>
+          <w:rFonts w:ascii="Arial" w:hAnsi="Arial" w:cs="Arial" w:eastAsia="Arial"/>
+          <w:rtl w:val="1"/>
+        </w:rPr>
+        <w:t xml:space="preserve"> هل أفهم هدف البطل والمشكلة؟ ضع خطًا تحت المقطع الذي يجيب.</w:t>
+      </w:r>
+    </w:p>
+    <w:p>
+      <w:pPr>
+        <w:spacing w:after="60"/>
+        <w:ind w:right="198" w:hanging="142"/>
+        <w:jc w:val="right"/>
+        <w:bidi w:val="1"/>
+      </w:pPr>
+      <w:r>
+        <w:rPr>
+          <w:rFonts w:ascii="Arial" w:hAnsi="Arial" w:cs="Arial" w:eastAsia="Arial"/>
+          <w:rtl w:val="1"/>
+        </w:rPr>
+        <w:t xml:space="preserve">• </w:t>
+      </w:r>
+      <w:r>
+        <w:rPr>
+          <w:rFonts w:ascii="Arial" w:hAnsi="Arial" w:cs="Arial" w:eastAsia="Arial"/>
+          <w:b/>
+          <w:rtl w:val="1"/>
+        </w:rPr>
+        <w:t>الجولة الثانية — الترابط:</w:t>
+      </w:r>
+      <w:r>
+        <w:rPr>
+          <w:rFonts w:ascii="Arial" w:hAnsi="Arial" w:cs="Arial" w:eastAsia="Arial"/>
+          <w:rtl w:val="1"/>
+        </w:rPr>
+        <w:t xml:space="preserve"> هل أعرف لماذا وقع الحدث التالي؟ أضف جملة انتقال أو غيّر ترتيب حدث عند الحاجة.</w:t>
+      </w:r>
+    </w:p>
+    <w:p>
+      <w:pPr>
+        <w:spacing w:after="60"/>
+        <w:ind w:right="198" w:hanging="142"/>
+        <w:jc w:val="right"/>
+        <w:bidi w:val="1"/>
+      </w:pPr>
+      <w:r>
+        <w:rPr>
+          <w:rFonts w:ascii="Arial" w:hAnsi="Arial" w:cs="Arial" w:eastAsia="Arial"/>
+          <w:rtl w:val="1"/>
+        </w:rPr>
+        <w:t xml:space="preserve">• </w:t>
+      </w:r>
+      <w:r>
+        <w:rPr>
+          <w:rFonts w:ascii="Arial" w:hAnsi="Arial" w:cs="Arial" w:eastAsia="Arial"/>
+          <w:b/>
+          <w:rtl w:val="1"/>
+        </w:rPr>
+        <w:t>الجولة الثالثة — اللغة:</w:t>
+      </w:r>
+      <w:r>
+        <w:rPr>
+          <w:rFonts w:ascii="Arial" w:hAnsi="Arial" w:cs="Arial" w:eastAsia="Arial"/>
+          <w:rtl w:val="1"/>
+        </w:rPr>
+        <w:t xml:space="preserve"> هل يستطيع القارئ قراءة الجملة؟ هل عرفت من يتكلم؟ راجع هدف التحرير الذي تعلمته المجموعة.</w:t>
+      </w:r>
+    </w:p>
+    <w:p>
+      <w:pPr>
+        <w:spacing w:after="60"/>
+        <w:ind w:right="198" w:hanging="142"/>
+        <w:jc w:val="right"/>
+        <w:bidi w:val="1"/>
+      </w:pPr>
+      <w:r>
+        <w:rPr>
+          <w:rFonts w:ascii="Arial" w:hAnsi="Arial" w:cs="Arial" w:eastAsia="Arial"/>
+          <w:rtl w:val="1"/>
+        </w:rPr>
+        <w:t xml:space="preserve">• </w:t>
+      </w:r>
+      <w:r>
+        <w:rPr>
+          <w:rFonts w:ascii="Arial" w:hAnsi="Arial" w:cs="Arial" w:eastAsia="Arial"/>
+          <w:b/>
+          <w:rtl w:val="1"/>
+        </w:rPr>
+        <w:t>الجولة الرابعة — الصوت:</w:t>
+      </w:r>
+      <w:r>
+        <w:rPr>
+          <w:rFonts w:ascii="Arial" w:hAnsi="Arial" w:cs="Arial" w:eastAsia="Arial"/>
+          <w:rtl w:val="1"/>
+        </w:rPr>
+        <w:t xml:space="preserve"> اقرأ النص أو استمع إليه، واختر جملة تريد الاحتفاظ بها كما هي.</w:t>
+      </w:r>
+    </w:p>
+    <w:p>
+      <w:pPr>
+        <w:jc w:val="right"/>
+        <w:widowControl/>
+        <w:bidi w:val="1"/>
+      </w:pPr>
+      <w:r>
+        <w:rPr>
+          <w:rFonts w:ascii="Arial" w:hAnsi="Arial" w:cs="Arial" w:eastAsia="Arial"/>
+          <w:rtl w:val="1"/>
+        </w:rPr>
+        <w:t>لا تطلب من الطفل إصلاح كل الملاحظات. يدون القارئ سؤالًا محددًا، ثم يختار الكاتب تعديلًا واحدًا أو يشرح لماذا سيحتفظ بصيغته. في نهاية الجولة، يسجل الطفل التغيير في ملفه: «غيّرت… لأن…». هذا السجل يجعل المراجعة مرئية ويعين الميسّر على معرفة الدعم الذي نجح.</w:t>
+      </w:r>
+    </w:p>
+    <w:p>
+      <w:pPr>
+        <w:jc w:val="right"/>
+        <w:widowControl/>
+        <w:bidi w:val="1"/>
+      </w:pPr>
+      <w:r>
+        <w:rPr>
+          <w:rFonts w:ascii="Arial" w:hAnsi="Arial" w:cs="Arial" w:eastAsia="Arial"/>
+          <w:rtl w:val="1"/>
+        </w:rPr>
+        <w:t>إذا كان الوقت ضيقًا، يمكن دمج الجولة الأولى والثانية، ثم مراجعة نقطة لغوية واحدة فقط. أما إذا كان النص طويلًا، فيختار الطفل صفحة أو مشهدًا للعمل عليه، ويعود إلى بقية القصة في لقاء آخر.</w:t>
+      </w:r>
+    </w:p>
+    <w:p>
+      <w:pPr>
+        <w:pStyle w:val="Heading2"/>
+        <w:jc w:val="right"/>
+        <w:bidi w:val="1"/>
+      </w:pPr>
+      <w:r>
+        <w:rPr>
+          <w:rFonts w:ascii="Arial" w:hAnsi="Arial" w:cs="Arial" w:eastAsia="Arial"/>
+          <w:rtl w:val="1"/>
+        </w:rPr>
         <w:t>مؤتمر الكاتب القصير</w:t>
       </w:r>
     </w:p>
@@ -10530,6 +13955,80 @@
           <w:rtl w:val="1"/>
         </w:rPr>
         <w:t>• في الفقرة الأخيرة يعود الجرس إلى القصة، فتتصل النهاية بتفصيل البداية.</w:t>
+      </w:r>
+    </w:p>
+    <w:p>
+      <w:pPr>
+        <w:pStyle w:val="Heading2"/>
+        <w:jc w:val="right"/>
+        <w:bidi w:val="1"/>
+      </w:pPr>
+      <w:r>
+        <w:rPr>
+          <w:rFonts w:ascii="Arial" w:hAnsi="Arial" w:cs="Arial" w:eastAsia="Arial"/>
+          <w:rtl w:val="1"/>
+        </w:rPr>
+        <w:t>نقل المهارات إلى نوع قصصي آخر</w:t>
+      </w:r>
+    </w:p>
+    <w:p>
+      <w:pPr>
+        <w:jc w:val="right"/>
+        <w:widowControl/>
+        <w:bidi w:val="1"/>
+      </w:pPr>
+      <w:r>
+        <w:rPr>
+          <w:rFonts w:ascii="Arial" w:hAnsi="Arial" w:cs="Arial" w:eastAsia="Arial"/>
+          <w:rtl w:val="1"/>
+        </w:rPr>
+        <w:t>لا يقتصر المنهج على قصة آدم ولولو. يمكن استخدام الخريطة نفسها في لغز قصير:</w:t>
+      </w:r>
+    </w:p>
+    <w:p>
+      <w:pPr>
+        <w:spacing w:before="80" w:after="160"/>
+        <w:ind w:right="142" w:left="142"/>
+        <w:jc w:val="right"/>
+        <w:bidi w:val="1"/>
+        <w:shd w:fill="EAF4F3"/>
+      </w:pPr>
+      <w:r>
+        <w:rPr>
+          <w:rFonts w:ascii="Arial" w:hAnsi="Arial" w:cs="Arial" w:eastAsia="Arial"/>
+          <w:color w:val="234C4E"/>
+          <w:sz w:val="20"/>
+          <w:rtl w:val="1"/>
+        </w:rPr>
+        <w:t>عند إغلاق المكتبة، سمع سامر ثلاث نقرات من رف الأطالس. أراد أن يعرف مصدرها قبل عودة أمينة المكتبة. بحث عن لعبة مخبأة، لكنه وجد نافذة مفتوحة وورقة صغيرة على الأرض. قرأ الورقة: «لا تنسوا أن تعيدوا الخريطة إلى مكانها». لاحظ أن كتابًا واحدًا مائل، فأعاده إلى الرف. توقفت النقرات؛ كان مقبض النافذة يلمس غلاف الكتاب كلما هب الهواء. كتب سامر ملاحظة للأمينة، ثم أغلق النافذة بمساعدتها.</w:t>
+      </w:r>
+    </w:p>
+    <w:p>
+      <w:pPr>
+        <w:jc w:val="right"/>
+        <w:widowControl/>
+        <w:bidi w:val="1"/>
+      </w:pPr>
+      <w:r>
+        <w:rPr>
+          <w:rFonts w:ascii="Arial" w:hAnsi="Arial" w:cs="Arial" w:eastAsia="Arial"/>
+          <w:rtl w:val="1"/>
+        </w:rPr>
+        <w:t>في هذه القصة توجد بذرة غموض، ودليلان، ومحاولة، وحل يفسر الصوت. يلاحظ الطفل أن الحل لم يظهر من فراغ؛ فالنافذة والكتاب ظهرا قبل التفسير. ويمكن تغيير النوع مع بقاء المبادئ: في قصة واقعية يكون السبب مألوفًا، وفي الفانتازيا يضع الكاتب قاعدة للعنصر العجيب، وفي الفكاهة يختار مفارقة تناسب الشخصيات.</w:t>
+      </w:r>
+    </w:p>
+    <w:p>
+      <w:pPr>
+        <w:jc w:val="right"/>
+        <w:widowControl/>
+        <w:bidi w:val="1"/>
+      </w:pPr>
+      <w:r>
+        <w:rPr>
+          <w:rFonts w:ascii="Arial" w:hAnsi="Arial" w:cs="Arial" w:eastAsia="Arial"/>
+          <w:rtl w:val="1"/>
+        </w:rPr>
+        <w:t>اسأل القارئ: ما الدليل الذي قاد سامر إلى الحل؟ ما المعلومة التي أضيفت متأخرًا؟ هل كان البطل مشاركًا في حل اللغز؟ ثم اطلب من كل طفل أن يكتب بذرة من نوع مختلف، كي يختبر أن الخريطة أداة مرنة وليست قالبًا لنوع واحد.</w:t>
       </w:r>
     </w:p>
     <w:p>

</xml_diff>